<commit_message>
Switch bibliography to Vancouver style with superscript citations
- Change bibliographystyle from unsrtnat to vancouver (initials-only authors, DOIs)
- Add doi package for DOI rendering in PDF
- Switch natbib from [numbers] to [super,comma] for superscript citations
- Add vancouver-superscript.csl for pandoc docx export
- Improve export_docx.sh: reference doc, citeproc with CSL, References heading
- Add postprocess_docx.py for caption numbering and bold table headers
- Add clean_bbl.py to strip BibTeX formatting artifacts for pandoc
- Gitignore cover letter
</commit_message>
<xml_diff>
--- a/paper/main.docx
+++ b/paper/main.docx
@@ -203,37 +203,37 @@
         <w:t xml:space="preserve">Quantitative systems pharmacology models translate mechanistic understanding of disease biology into predictions of drug response</w:t>
       </w:r>
       <w:r>
-        <w:t xml:space="preserve"> </w:t>
-      </w:r>
-      <w:r>
-        <w:t xml:space="preserve">(Gadkar et al. 2016)</w:t>
+        <w:rPr>
+          <w:vertAlign w:val="superscript"/>
+        </w:rPr>
+        <w:t xml:space="preserve">1</w:t>
       </w:r>
       <w:r>
         <w:t xml:space="preserve">. QSP models can comprise tens to hundreds of ordinary differential equations, and calibration requires data from diverse sources including targeted experimental studies and clinical endpoints</w:t>
       </w:r>
       <w:r>
-        <w:t xml:space="preserve"> </w:t>
-      </w:r>
-      <w:r>
-        <w:t xml:space="preserve">(H. Wang et al. 2025, 2024)</w:t>
+        <w:rPr>
+          <w:vertAlign w:val="superscript"/>
+        </w:rPr>
+        <w:t xml:space="preserve">2,3</w:t>
       </w:r>
       <w:r>
         <w:t xml:space="preserve">. Because virtual population generation and virtual clinical trials depend on parameter distributions rather than point estimates</w:t>
       </w:r>
       <w:r>
-        <w:t xml:space="preserve"> </w:t>
-      </w:r>
-      <w:r>
-        <w:t xml:space="preserve">(Rieger et al. 2018; Craig et al. 2023)</w:t>
+        <w:rPr>
+          <w:vertAlign w:val="superscript"/>
+        </w:rPr>
+        <w:t xml:space="preserve">4,5</w:t>
       </w:r>
       <w:r>
         <w:t xml:space="preserve">, calibration must quantify uncertainty. As QSP increasingly integrates with machine learning</w:t>
       </w:r>
       <w:r>
-        <w:t xml:space="preserve"> </w:t>
-      </w:r>
-      <w:r>
-        <w:t xml:space="preserve">(Folguera-Blasco et al. 2024; Terranova et al. 2024; Goryanin, Goryanin, and Demin 2025; Androulakis, Cucurull-Sanchez, et al. 2025; Androulakis, Cheng, et al. 2025)</w:t>
+        <w:rPr>
+          <w:vertAlign w:val="superscript"/>
+        </w:rPr>
+        <w:t xml:space="preserve">6–10</w:t>
       </w:r>
       <w:r>
         <w:t xml:space="preserve">, the bottleneck of manual parameter extraction becomes more acute.</w:t>
@@ -271,10 +271,10 @@
         <w:t xml:space="preserve">Manual curation remains the standard approach but is labor-intensive, with inconsistent documentation across individuals and projects. When personnel change, the reasoning behind parameter choices may be lost. Without structured representations, combining constraints from multiple experiments requires ad-hoc scripting with no standard path from extracted data to inference code. Traditional NLP pipelines for automated extraction require task-specific training data</w:t>
       </w:r>
       <w:r>
-        <w:t xml:space="preserve"> </w:t>
-      </w:r>
-      <w:r>
-        <w:t xml:space="preserve">(Zhao et al. 2021; Hu et al. 2024; Gonzalez Hernandez et al. 2024)</w:t>
+        <w:rPr>
+          <w:vertAlign w:val="superscript"/>
+        </w:rPr>
+        <w:t xml:space="preserve">11–13</w:t>
       </w:r>
       <w:r>
         <w:t xml:space="preserve"> </w:t>
@@ -291,28 +291,28 @@
         <w:t xml:space="preserve">Large language models offer a more flexible approach. LLMs can identify relevant literature given mechanistic context, read scientific text, and extract information into structured templates</w:t>
       </w:r>
       <w:r>
-        <w:t xml:space="preserve"> </w:t>
-      </w:r>
-      <w:r>
-        <w:t xml:space="preserve">(He et al. 2026; Khan et al. 2024; Saini and Farnoud 2025; Hsu and Roberts 2025; X. Wang et al. 2025)</w:t>
+        <w:rPr>
+          <w:vertAlign w:val="superscript"/>
+        </w:rPr>
+        <w:t xml:space="preserve">14–18</w:t>
       </w:r>
       <w:r>
         <w:t xml:space="preserve">. However, LLMs exhibit hallucination and fabrication errors that are unacceptable for quantitative modeling</w:t>
       </w:r>
       <w:r>
-        <w:t xml:space="preserve"> </w:t>
-      </w:r>
-      <w:r>
-        <w:t xml:space="preserve">(Farquhar et al. 2024; Huang et al. 2025; Pandit et al. 2025)</w:t>
+        <w:rPr>
+          <w:vertAlign w:val="superscript"/>
+        </w:rPr>
+        <w:t xml:space="preserve">19–21</w:t>
       </w:r>
       <w:r>
         <w:t xml:space="preserve">. Many of these failure modes, however, are amenable to systematic detection: hallucinated values can be caught by requiring verbatim source text, fabricated citations through DOI resolution, and internal inconsistencies through schema validation. This suggests a workflow where LLMs handle extraction while automated validators catch characteristic errors, with Pydantic</w:t>
       </w:r>
       <w:r>
-        <w:t xml:space="preserve"> </w:t>
-      </w:r>
-      <w:r>
-        <w:t xml:space="preserve">(Colvin et al. 2025)</w:t>
+        <w:rPr>
+          <w:vertAlign w:val="superscript"/>
+        </w:rPr>
+        <w:t xml:space="preserve">22</w:t>
       </w:r>
       <w:r>
         <w:t xml:space="preserve">, a Python data validation library, enabling a self-correcting retry loop.</w:t>
@@ -839,10 +839,10 @@
         <w:t xml:space="preserve">Both schemas are implemented using Pydantic</w:t>
       </w:r>
       <w:r>
-        <w:t xml:space="preserve"> </w:t>
-      </w:r>
-      <w:r>
-        <w:t xml:space="preserve">(Colvin et al. 2025)</w:t>
+        <w:rPr>
+          <w:vertAlign w:val="superscript"/>
+        </w:rPr>
+        <w:t xml:space="preserve">22</w:t>
       </w:r>
       <w:r>
         <w:t xml:space="preserve"> </w:t>
@@ -1021,10 +1021,10 @@
         <w:t xml:space="preserve">parses all unit strings using Pint</w:t>
       </w:r>
       <w:r>
-        <w:t xml:space="preserve"> </w:t>
-      </w:r>
-      <w:r>
-        <w:t xml:space="preserve">(Grecco 2025)</w:t>
+        <w:rPr>
+          <w:vertAlign w:val="superscript"/>
+        </w:rPr>
+        <w:t xml:space="preserve">23</w:t>
       </w:r>
       <w:r>
         <w:t xml:space="preserve"> </w:t>
@@ -1131,10 +1131,10 @@
         <w:t xml:space="preserve">. Exception messages are designed for the LLM retry loop, including both the specific failure and guidance for correction. Optional Logfire instrumentation</w:t>
       </w:r>
       <w:r>
-        <w:t xml:space="preserve"> </w:t>
-      </w:r>
-      <w:r>
-        <w:t xml:space="preserve">(Pydantic 2025)</w:t>
+        <w:rPr>
+          <w:vertAlign w:val="superscript"/>
+        </w:rPr>
+        <w:t xml:space="preserve">24</w:t>
       </w:r>
       <w:r>
         <w:t xml:space="preserve"> </w:t>
@@ -1225,10 +1225,10 @@
         <w:t xml:space="preserve">Validated SubmodelTarget specifications can be automatically translated into Julia scripts for Bayesian inference using Turing.jl</w:t>
       </w:r>
       <w:r>
-        <w:t xml:space="preserve"> </w:t>
-      </w:r>
-      <w:r>
-        <w:t xml:space="preserve">(Ge, Xu, and Ghahramani 2018)</w:t>
+        <w:rPr>
+          <w:vertAlign w:val="superscript"/>
+        </w:rPr>
+        <w:t xml:space="preserve">25</w:t>
       </w:r>
       <w:r>
         <w:t xml:space="preserve">. The translator generates self-contained scripts with observed data constants, forward model functions, prior distributions, and likelihood terms. When multiple targets share parameters (identified by matching parameter names), the translator generates a joint model that declares each shared parameter once and constrains it from all relevant data sources simultaneously, yielding tighter posteriors than independent calibration. We chose to generate complete, readable scripts rather than provide a library abstraction, so that users can inspect, modify, and debug the inference model directly. Supplementary Section S4 provides details on the generated code structure, forward model handling, and inference diagnostics.</w:t>
@@ -1269,10 +1269,10 @@
         <w:t xml:space="preserve">The PDAC QSP model used in this study is adapted from a spatial QSP model of hepatocellular carcinoma</w:t>
       </w:r>
       <w:r>
-        <w:t xml:space="preserve"> </w:t>
-      </w:r>
-      <w:r>
-        <w:t xml:space="preserve">(Zhang et al. 2025)</w:t>
+        <w:rPr>
+          <w:vertAlign w:val="superscript"/>
+        </w:rPr>
+        <w:t xml:space="preserve">26</w:t>
       </w:r>
       <w:r>
         <w:t xml:space="preserve"> </w:t>
@@ -1380,14 +1380,6 @@
       </w:r>
     </w:p>
     <w:bookmarkStart w:id="38" w:name="tab:extraction"/>
-    <w:p>
-      <w:pPr>
-        <w:pStyle w:val="TableCaption"/>
-      </w:pPr>
-      <w:r>
-        <w:t xml:space="preserve">Extraction metrics per calibration target.</w:t>
-      </w:r>
-    </w:p>
     <w:tbl>
       <w:tblPr>
         <w:tblStyle w:val="Table"/>
@@ -1413,6 +1405,9 @@
               <w:jc w:val="left"/>
             </w:pPr>
             <w:r>
+              <w:rPr>
+                <w:b/>
+              </w:rPr>
               <w:t xml:space="preserve">Target</w:t>
             </w:r>
           </w:p>
@@ -1425,6 +1420,9 @@
               <w:jc w:val="center"/>
             </w:pPr>
             <w:r>
+              <w:rPr>
+                <w:b/>
+              </w:rPr>
               <w:t xml:space="preserve">Retries</w:t>
             </w:r>
           </w:p>
@@ -1437,6 +1435,9 @@
               <w:jc w:val="center"/>
             </w:pPr>
             <w:r>
+              <w:rPr>
+                <w:b/>
+              </w:rPr>
               <w:t xml:space="preserve">Duration (min)</w:t>
             </w:r>
           </w:p>
@@ -1449,6 +1450,9 @@
               <w:jc w:val="center"/>
             </w:pPr>
             <w:r>
+              <w:rPr>
+                <w:b/>
+              </w:rPr>
               <w:t xml:space="preserve">Tokens</w:t>
             </w:r>
           </w:p>
@@ -2475,6 +2479,26 @@
         </w:tc>
       </w:tr>
     </w:tbl>
+    <w:p>
+      <w:pPr>
+        <w:pStyle w:val="TableCaption"/>
+      </w:pPr>
+      <w:r>
+        <w:rPr>
+          <w:rFonts w:ascii="Arial" w:hAnsi="Arial"/>
+          <w:b/>
+          <w:sz w:val="20"/>
+        </w:rPr>
+        <w:t xml:space="preserve">Table 1. </w:t>
+      </w:r>
+      <w:r>
+        <w:rPr>
+          <w:rFonts w:ascii="Arial" w:hAnsi="Arial"/>
+          <w:sz w:val="20"/>
+        </w:rPr>
+        <w:t>Extraction metrics per calibration target.</w:t>
+      </w:r>
+    </w:p>
     <w:bookmarkEnd w:id="38"/>
     <w:p>
       <w:pPr>
@@ -2559,19 +2583,23 @@
         <w:pStyle w:val="ImageCaption"/>
       </w:pPr>
       <w:r>
-        <w:t xml:space="preserve">Distribution of automated retry counts across 18 extraction attempts.</w:t>
+        <w:rPr>
+          <w:rFonts w:ascii="Arial" w:hAnsi="Arial"/>
+          <w:b/>
+          <w:sz w:val="20"/>
+        </w:rPr>
+        <w:t xml:space="preserve">Figure 1. </w:t>
+      </w:r>
+      <w:r>
+        <w:rPr>
+          <w:rFonts w:ascii="Arial" w:hAnsi="Arial"/>
+          <w:sz w:val="20"/>
+        </w:rPr>
+        <w:t>Distribution of automated retry counts across 18 extraction attempts.</w:t>
       </w:r>
     </w:p>
     <w:bookmarkEnd w:id="42"/>
     <w:bookmarkStart w:id="43" w:name="tab:error-categories"/>
-    <w:p>
-      <w:pPr>
-        <w:pStyle w:val="TableCaption"/>
-      </w:pPr>
-      <w:r>
-        <w:t xml:space="preserve">Error categories caught by validators during batch extraction. Units: incorrect or inconsistent unit conversions. Prior: proposed uncertainty range incompatible with stated translation context. Fabrication: LLM-generated DOIs or citations that do not resolve to real publications. Code: observation function fails unit checks or execution. Hallucination: extracted values not found in the cited source text. Each target may trigger multiple errors.</w:t>
-      </w:r>
-    </w:p>
     <w:tbl>
       <w:tblPr>
         <w:tblStyle w:val="Table"/>
@@ -2596,6 +2624,9 @@
               <w:jc w:val="left"/>
             </w:pPr>
             <w:r>
+              <w:rPr>
+                <w:b/>
+              </w:rPr>
               <w:t xml:space="preserve">Error Category</w:t>
             </w:r>
           </w:p>
@@ -2608,6 +2639,9 @@
               <w:jc w:val="center"/>
             </w:pPr>
             <w:r>
+              <w:rPr>
+                <w:b/>
+              </w:rPr>
               <w:t xml:space="preserve">Count</w:t>
             </w:r>
           </w:p>
@@ -2620,6 +2654,9 @@
               <w:jc w:val="center"/>
             </w:pPr>
             <w:r>
+              <w:rPr>
+                <w:b/>
+              </w:rPr>
               <w:t xml:space="preserve">%</w:t>
             </w:r>
           </w:p>
@@ -2896,6 +2933,26 @@
         </w:tc>
       </w:tr>
     </w:tbl>
+    <w:p>
+      <w:pPr>
+        <w:pStyle w:val="TableCaption"/>
+      </w:pPr>
+      <w:r>
+        <w:rPr>
+          <w:rFonts w:ascii="Arial" w:hAnsi="Arial"/>
+          <w:b/>
+          <w:sz w:val="20"/>
+        </w:rPr>
+        <w:t xml:space="preserve">Table 2. </w:t>
+      </w:r>
+      <w:r>
+        <w:rPr>
+          <w:rFonts w:ascii="Arial" w:hAnsi="Arial"/>
+          <w:sz w:val="20"/>
+        </w:rPr>
+        <w:t>Error categories caught by validators during batch extraction. Units: incorrect or inconsistent unit conversions. Prior: proposed uncertainty range incompatible with stated translation context. Fabrication: LLM-generated DOIs or citations that do not resolve to real publications. Code: observation function fails unit checks or execution. Hallucination: extracted values not found in the cited source text. Each target may trigger multiple errors.</w:t>
+      </w:r>
+    </w:p>
     <w:bookmarkEnd w:id="43"/>
     <w:bookmarkStart w:id="44" w:name="source-characteristics"/>
     <w:p>
@@ -3023,14 +3080,6 @@
       </w:r>
     </w:p>
     <w:bookmarkStart w:id="47" w:name="tab:ct-summary"/>
-    <w:p>
-      <w:pPr>
-        <w:pStyle w:val="TableCaption"/>
-      </w:pPr>
-      <w:r>
-        <w:t xml:space="preserve">CalibrationTarget summary by scenario group.</w:t>
-      </w:r>
-    </w:p>
     <w:tbl>
       <w:tblPr>
         <w:tblStyle w:val="Table"/>
@@ -3054,6 +3103,9 @@
               <w:jc w:val="left"/>
             </w:pPr>
             <w:r>
+              <w:rPr>
+                <w:b/>
+              </w:rPr>
               <w:t xml:space="preserve">Scenario Group</w:t>
             </w:r>
           </w:p>
@@ -3066,6 +3118,9 @@
               <w:jc w:val="right"/>
             </w:pPr>
             <w:r>
+              <w:rPr>
+                <w:b/>
+              </w:rPr>
               <w:t xml:space="preserve">Targets</w:t>
             </w:r>
           </w:p>
@@ -3201,6 +3256,26 @@
         </w:tc>
       </w:tr>
     </w:tbl>
+    <w:p>
+      <w:pPr>
+        <w:pStyle w:val="TableCaption"/>
+      </w:pPr>
+      <w:r>
+        <w:rPr>
+          <w:rFonts w:ascii="Arial" w:hAnsi="Arial"/>
+          <w:b/>
+          <w:sz w:val="20"/>
+        </w:rPr>
+        <w:t xml:space="preserve">Table 3. </w:t>
+      </w:r>
+      <w:r>
+        <w:rPr>
+          <w:rFonts w:ascii="Arial" w:hAnsi="Arial"/>
+          <w:sz w:val="20"/>
+        </w:rPr>
+        <w:t>CalibrationTarget summary by scenario group.</w:t>
+      </w:r>
+    </w:p>
     <w:bookmarkEnd w:id="47"/>
     <w:p>
       <w:pPr>
@@ -3256,10 +3331,10 @@
         <w:t xml:space="preserve">All 18 SubmodelTargets were translated to a joint Julia inference script targeting Turing.jl</w:t>
       </w:r>
       <w:r>
-        <w:t xml:space="preserve"> </w:t>
-      </w:r>
-      <w:r>
-        <w:t xml:space="preserve">(Ge, Xu, and Ghahramani 2018)</w:t>
+        <w:rPr>
+          <w:vertAlign w:val="superscript"/>
+        </w:rPr>
+        <w:t xml:space="preserve">25</w:t>
       </w:r>
       <w:r>
         <w:t xml:space="preserve">. The translator identified 19 unique parameters and generated corresponding priors and likelihood terms. All parameters converged (</w:t>
@@ -3508,28 +3583,28 @@
         <w:t xml:space="preserve">MAPLE addresses a gap between general-purpose biomedical extraction frameworks</w:t>
       </w:r>
       <w:r>
-        <w:t xml:space="preserve"> </w:t>
-      </w:r>
-      <w:r>
-        <w:t xml:space="preserve">(Hsu and Roberts 2025; X. Wang et al. 2025)</w:t>
+        <w:rPr>
+          <w:vertAlign w:val="superscript"/>
+        </w:rPr>
+        <w:t xml:space="preserve">17,18</w:t>
       </w:r>
       <w:r>
         <w:t xml:space="preserve">, which do not address QSP-specific downstream requirements (uncertainty quantification, forward model specification, code generation), and QSP-focused tools like QSP-Copilot</w:t>
       </w:r>
       <w:r>
-        <w:t xml:space="preserve"> </w:t>
-      </w:r>
-      <w:r>
-        <w:t xml:space="preserve">(Saini and Farnoud 2025)</w:t>
+        <w:rPr>
+          <w:vertAlign w:val="superscript"/>
+        </w:rPr>
+        <w:t xml:space="preserve">16</w:t>
       </w:r>
       <w:r>
         <w:t xml:space="preserve">, which emphasize model structure discovery rather than quantitative parameter calibration with provenance. The validation approach combines grounding strategies from retrieval-augmented generation</w:t>
       </w:r>
       <w:r>
-        <w:t xml:space="preserve"> </w:t>
-      </w:r>
-      <w:r>
-        <w:t xml:space="preserve">(Li et al. 2025)</w:t>
+        <w:rPr>
+          <w:vertAlign w:val="superscript"/>
+        </w:rPr>
+        <w:t xml:space="preserve">27</w:t>
       </w:r>
       <w:r>
         <w:t xml:space="preserve"> </w:t>
@@ -3538,10 +3613,10 @@
         <w:t xml:space="preserve">and constrained decoding</w:t>
       </w:r>
       <w:r>
-        <w:t xml:space="preserve"> </w:t>
-      </w:r>
-      <w:r>
-        <w:t xml:space="preserve">(Geng et al. 2025)</w:t>
+        <w:rPr>
+          <w:vertAlign w:val="superscript"/>
+        </w:rPr>
+        <w:t xml:space="preserve">28</w:t>
       </w:r>
       <w:r>
         <w:t xml:space="preserve"> </w:t>
@@ -3558,10 +3633,10 @@
         <w:t xml:space="preserve">Unlike knowledge graph approaches that prioritize coverage across thousands of abstracts</w:t>
       </w:r>
       <w:r>
-        <w:t xml:space="preserve"> </w:t>
-      </w:r>
-      <w:r>
-        <w:t xml:space="preserve">(He et al. 2026; Gao et al. 2024)</w:t>
+        <w:rPr>
+          <w:vertAlign w:val="superscript"/>
+        </w:rPr>
+        <w:t xml:space="preserve">14,29</w:t>
       </w:r>
       <w:r>
         <w:t xml:space="preserve"> </w:t>
@@ -3570,10 +3645,10 @@
         <w:t xml:space="preserve">and can tolerate some extraction errors, parameter calibration requires higher per-target stringency because each value directly influences model predictions. MAPLE aligns with IQ Consortium best practices for AI/ML in quantitative modeling</w:t>
       </w:r>
       <w:r>
-        <w:t xml:space="preserve"> </w:t>
-      </w:r>
-      <w:r>
-        <w:t xml:space="preserve">(Terranova et al. 2024)</w:t>
+        <w:rPr>
+          <w:vertAlign w:val="superscript"/>
+        </w:rPr>
+        <w:t xml:space="preserve">7</w:t>
       </w:r>
       <w:r>
         <w:t xml:space="preserve">, emphasizing explainability, human-in-the-loop oversight, and documented provenance. While evaluated on a QSP model, the approach applies to any parameter-rich mechanistic model that draws calibration data from literature. A more detailed comparison of individual tools and approaches is provided in Supplementary Section S15.</w:t>
@@ -3750,7 +3825,7 @@
       </w:r>
     </w:p>
     <w:bookmarkEnd w:id="59"/>
-    <w:bookmarkStart w:id="121" w:name="data-availability-statement"/>
+    <w:bookmarkStart w:id="62" w:name="data-availability-statement"/>
     <w:p>
       <w:pPr>
         <w:pStyle w:val="Heading1"/>
@@ -3795,121 +3870,86 @@
         <w:t xml:space="preserve">. The PDAC calibration targets used in this study (18 SubmodelTargets and 59 CalibrationTargets) are provided as supplementary YAML files. Generated Julia inference scripts are included in the supplementary materials.</w:t>
       </w:r>
     </w:p>
-    <w:bookmarkStart w:id="120" w:name="refs"/>
-    <w:bookmarkStart w:id="63" w:name="X8c415a993717a716f25d3c033f922e736091439"/>
+    <w:bookmarkEnd w:id="62"/>
+    <w:bookmarkStart w:id="132" w:name="bibliography"/>
+    <w:p>
+      <w:pPr>
+        <w:pStyle w:val="Heading1"/>
+      </w:pPr>
+      <w:r>
+        <w:t xml:space="preserve">References</w:t>
+      </w:r>
+    </w:p>
+    <w:bookmarkStart w:id="131" w:name="refs"/>
+    <w:bookmarkStart w:id="66" w:name="ref-gadkarSixStageWorkflowRobust2016"/>
     <w:p>
       <w:pPr>
         <w:pStyle w:val="Bibliography"/>
       </w:pPr>
       <w:r>
-        <w:t xml:space="preserve">Androulakis, Ioannis P., Limei Cheng, Carolyn R. Cho, and Tongli Zhang. 2025.</w:t>
-      </w:r>
-      <w:r>
-        <w:t xml:space="preserve"> </w:t>
-      </w:r>
-      <w:r>
-        <w:t xml:space="preserve">“Leveraging Large Language Models to Compare Perspectives on Integrating</w:t>
-      </w:r>
-      <w:r>
-        <w:t xml:space="preserve"> </w:t>
-      </w:r>
-      <w:r>
-        <w:t xml:space="preserve">QSP</w:t>
-      </w:r>
-      <w:r>
-        <w:t xml:space="preserve"> </w:t>
-      </w:r>
-      <w:r>
-        <w:t xml:space="preserve">and</w:t>
-      </w:r>
-      <w:r>
-        <w:t xml:space="preserve"> </w:t>
-      </w:r>
-      <w:r>
-        <w:t xml:space="preserve">AI</w:t>
-      </w:r>
-      <w:r>
-        <w:t xml:space="preserve">/</w:t>
-      </w:r>
-      <w:r>
-        <w:t xml:space="preserve">ML</w:t>
-      </w:r>
-      <w:r>
-        <w:t xml:space="preserve">.”</w:t>
-      </w:r>
-      <w:r>
-        <w:t xml:space="preserve"> </w:t>
-      </w:r>
-      <w:r>
-        <w:rPr>
-          <w:i/>
-          <w:iCs/>
-        </w:rPr>
-        <w:t xml:space="preserve">Journal of Pharmacokinetics and Pharmacodynamics</w:t>
-      </w:r>
-      <w:r>
-        <w:t xml:space="preserve"> </w:t>
-      </w:r>
-      <w:r>
-        <w:t xml:space="preserve">52 (3): 29.</w:t>
-      </w:r>
-      <w:r>
-        <w:t xml:space="preserve"> </w:t>
-      </w:r>
-      <w:hyperlink r:id="rId62">
+        <w:t xml:space="preserve">1.</w:t>
+      </w:r>
+      <w:r>
+        <w:t xml:space="preserve"> </w:t>
+      </w:r>
+      <w:r>
+        <w:t xml:space="preserve">	</w:t>
+      </w:r>
+      <w:r>
+        <w:t xml:space="preserve">Gadkar K, Kirouac D, Mager D, van der Graaf P, Ramanujan S. A</w:t>
+      </w:r>
+      <w:r>
+        <w:t xml:space="preserve"> </w:t>
+      </w:r>
+      <w:r>
+        <w:t xml:space="preserve">Six</w:t>
+      </w:r>
+      <w:r>
+        <w:t xml:space="preserve">-</w:t>
+      </w:r>
+      <w:r>
+        <w:t xml:space="preserve">Stage Workflow</w:t>
+      </w:r>
+      <w:r>
+        <w:t xml:space="preserve"> </w:t>
+      </w:r>
+      <w:r>
+        <w:t xml:space="preserve">for</w:t>
+      </w:r>
+      <w:r>
+        <w:t xml:space="preserve"> </w:t>
+      </w:r>
+      <w:r>
+        <w:t xml:space="preserve">Robust Application</w:t>
+      </w:r>
+      <w:r>
+        <w:t xml:space="preserve"> </w:t>
+      </w:r>
+      <w:r>
+        <w:t xml:space="preserve">of</w:t>
+      </w:r>
+      <w:r>
+        <w:t xml:space="preserve"> </w:t>
+      </w:r>
+      <w:r>
+        <w:t xml:space="preserve">Systems Pharmacology</w:t>
+      </w:r>
+      <w:r>
+        <w:t xml:space="preserve">. CPT: Pharmacometrics &amp; Systems Pharmacology. 2016 May;5(5):235–49. doi:</w:t>
+      </w:r>
+      <w:hyperlink r:id="rId63">
         <w:r>
           <w:rPr>
             <w:rStyle w:val="Hyperlink"/>
           </w:rPr>
-          <w:t xml:space="preserve">https://doi.org/10.1007/s10928-025-09976-5</w:t>
+          <w:t xml:space="preserve">10.1002/psp4.12071</w:t>
         </w:r>
       </w:hyperlink>
       <w:r>
-        <w:t xml:space="preserve">.</w:t>
-      </w:r>
-    </w:p>
-    <w:bookmarkEnd w:id="63"/>
-    <w:bookmarkStart w:id="65" w:name="ref-androulakisDawnNewEra2025"/>
-    <w:p>
-      <w:pPr>
-        <w:pStyle w:val="Bibliography"/>
-      </w:pPr>
-      <w:r>
-        <w:t xml:space="preserve">Androulakis, Ioannis P., Lourdes Cucurull-Sanchez, Anna Kondic, Krina Mehta, Cesar Pichardo, Meghan Pryor, and Marissa Renardy. 2025.</w:t>
-      </w:r>
-      <w:r>
-        <w:t xml:space="preserve"> </w:t>
-      </w:r>
-      <w:r>
-        <w:t xml:space="preserve">“The Dawn of a New Era: Can Machine Learning and Large Language Models Reshape</w:t>
-      </w:r>
-      <w:r>
-        <w:t xml:space="preserve"> </w:t>
-      </w:r>
-      <w:r>
-        <w:t xml:space="preserve">QSP</w:t>
-      </w:r>
-      <w:r>
-        <w:t xml:space="preserve"> </w:t>
-      </w:r>
-      <w:r>
-        <w:t xml:space="preserve">Modeling?”</w:t>
-      </w:r>
-      <w:r>
-        <w:t xml:space="preserve"> </w:t>
-      </w:r>
-      <w:r>
-        <w:rPr>
-          <w:i/>
-          <w:iCs/>
-        </w:rPr>
-        <w:t xml:space="preserve">Journal of Pharmacokinetics and Pharmacodynamics</w:t>
-      </w:r>
-      <w:r>
-        <w:t xml:space="preserve"> </w:t>
-      </w:r>
-      <w:r>
-        <w:t xml:space="preserve">52 (4): 36.</w:t>
+        <w:t xml:space="preserve"> </w:t>
+      </w:r>
+      <w:r>
+        <w:t xml:space="preserve">PubMed PMID:</w:t>
       </w:r>
       <w:r>
         <w:t xml:space="preserve"> </w:t>
@@ -3919,38 +3959,1206 @@
           <w:rPr>
             <w:rStyle w:val="Hyperlink"/>
           </w:rPr>
-          <w:t xml:space="preserve">https://doi.org/10.1007/s10928-025-09984-5</w:t>
+          <w:t xml:space="preserve">27299936</w:t>
         </w:r>
       </w:hyperlink>
       <w:r>
+        <w:t xml:space="preserve">; PubMed Central PMCID:</w:t>
+      </w:r>
+      <w:r>
+        <w:t xml:space="preserve"> </w:t>
+      </w:r>
+      <w:hyperlink r:id="rId65">
+        <w:r>
+          <w:rPr>
+            <w:rStyle w:val="Hyperlink"/>
+          </w:rPr>
+          <w:t xml:space="preserve">PMC4879472</w:t>
+        </w:r>
+      </w:hyperlink>
+      <w:r>
         <w:t xml:space="preserve">.</w:t>
       </w:r>
     </w:p>
-    <w:bookmarkEnd w:id="65"/>
-    <w:bookmarkStart w:id="67" w:name="ref-Colvin_Pydantic_Validation_2025"/>
+    <w:bookmarkEnd w:id="66"/>
+    <w:bookmarkStart w:id="70" w:name="X793781ed149e50493dc391e82aa31eba70e69be"/>
     <w:p>
       <w:pPr>
         <w:pStyle w:val="Bibliography"/>
       </w:pPr>
       <w:r>
-        <w:t xml:space="preserve">Colvin, Samuel, Eric Jolibois, Hasan Ramezani, Adrian Garcia Badaracco, Terrence Dorsey, David Montague, Serge Matveenko, et al. 2025.</w:t>
-      </w:r>
-      <w:r>
-        <w:t xml:space="preserve"> </w:t>
-      </w:r>
-      <w:r>
-        <w:t xml:space="preserve">“</w:t>
+        <w:t xml:space="preserve">2.</w:t>
+      </w:r>
+      <w:r>
+        <w:t xml:space="preserve"> </w:t>
+      </w:r>
+      <w:r>
+        <w:t xml:space="preserve">	</w:t>
+      </w:r>
+      <w:r>
+        <w:t xml:space="preserve">Wang H, Arulraj T, Ippolito A, Popel AS. Quantitative</w:t>
+      </w:r>
+      <w:r>
+        <w:t xml:space="preserve"> </w:t>
+      </w:r>
+      <w:r>
+        <w:t xml:space="preserve">Systems Pharmacology Modeling</w:t>
+      </w:r>
+      <w:r>
+        <w:t xml:space="preserve"> </w:t>
+      </w:r>
+      <w:r>
+        <w:t xml:space="preserve">in</w:t>
+      </w:r>
+      <w:r>
+        <w:t xml:space="preserve"> </w:t>
+      </w:r>
+      <w:r>
+        <w:t xml:space="preserve">Immuno-Oncology</w:t>
+      </w:r>
+      <w:r>
+        <w:t xml:space="preserve">:</w:t>
+      </w:r>
+      <w:r>
+        <w:t xml:space="preserve"> </w:t>
+      </w:r>
+      <w:r>
+        <w:t xml:space="preserve">Hypothesis Testing</w:t>
+      </w:r>
+      <w:r>
+        <w:t xml:space="preserve">,</w:t>
+      </w:r>
+      <w:r>
+        <w:t xml:space="preserve"> </w:t>
+      </w:r>
+      <w:r>
+        <w:t xml:space="preserve">Dose Optimization</w:t>
+      </w:r>
+      <w:r>
+        <w:t xml:space="preserve">, and</w:t>
+      </w:r>
+      <w:r>
+        <w:t xml:space="preserve"> </w:t>
+      </w:r>
+      <w:r>
+        <w:t xml:space="preserve">Efficacy Prediction</w:t>
+      </w:r>
+      <w:r>
+        <w:t xml:space="preserve">. Handbook of Experimental Pharmacology. 2025;289:261–84. doi:</w:t>
+      </w:r>
+      <w:hyperlink r:id="rId67">
+        <w:r>
+          <w:rPr>
+            <w:rStyle w:val="Hyperlink"/>
+          </w:rPr>
+          <w:t xml:space="preserve">10.1007/164_2024_735</w:t>
+        </w:r>
+      </w:hyperlink>
+      <w:r>
+        <w:t xml:space="preserve"> </w:t>
+      </w:r>
+      <w:r>
+        <w:t xml:space="preserve">PubMed PMID:</w:t>
+      </w:r>
+      <w:r>
+        <w:t xml:space="preserve"> </w:t>
+      </w:r>
+      <w:hyperlink r:id="rId68">
+        <w:r>
+          <w:rPr>
+            <w:rStyle w:val="Hyperlink"/>
+          </w:rPr>
+          <w:t xml:space="preserve">39707022</w:t>
+        </w:r>
+      </w:hyperlink>
+      <w:r>
+        <w:t xml:space="preserve">; PubMed Central PMCID:</w:t>
+      </w:r>
+      <w:r>
+        <w:t xml:space="preserve"> </w:t>
+      </w:r>
+      <w:hyperlink r:id="rId69">
+        <w:r>
+          <w:rPr>
+            <w:rStyle w:val="Hyperlink"/>
+          </w:rPr>
+          <w:t xml:space="preserve">PMC12713570</w:t>
+        </w:r>
+      </w:hyperlink>
+      <w:r>
+        <w:t xml:space="preserve">.</w:t>
+      </w:r>
+    </w:p>
+    <w:bookmarkEnd w:id="70"/>
+    <w:bookmarkStart w:id="72" w:name="ref-wangVirtualPatientsDigital2024"/>
+    <w:p>
+      <w:pPr>
+        <w:pStyle w:val="Bibliography"/>
+      </w:pPr>
+      <w:r>
+        <w:t xml:space="preserve">3.</w:t>
+      </w:r>
+      <w:r>
+        <w:t xml:space="preserve"> </w:t>
+      </w:r>
+      <w:r>
+        <w:t xml:space="preserve">	</w:t>
+      </w:r>
+      <w:r>
+        <w:t xml:space="preserve">Wang H, Arulraj T, Ippolito A, Popel AS. From virtual patients to digital twins in immuno-oncology: Lessons learned from mechanistic quantitative systems pharmacology modeling. npj Digital Medicine. 2024 Jul;7(1):189. doi:</w:t>
+      </w:r>
+      <w:hyperlink r:id="rId71">
+        <w:r>
+          <w:rPr>
+            <w:rStyle w:val="Hyperlink"/>
+          </w:rPr>
+          <w:t xml:space="preserve">10.1038/s41746-024-01188-4</w:t>
+        </w:r>
+      </w:hyperlink>
+    </w:p>
+    <w:bookmarkEnd w:id="72"/>
+    <w:bookmarkStart w:id="74" w:name="X39e1811d99360c3b2419412e4379c4441c3ec60"/>
+    <w:p>
+      <w:pPr>
+        <w:pStyle w:val="Bibliography"/>
+      </w:pPr>
+      <w:r>
+        <w:t xml:space="preserve">4.</w:t>
+      </w:r>
+      <w:r>
+        <w:t xml:space="preserve"> </w:t>
+      </w:r>
+      <w:r>
+        <w:t xml:space="preserve">	</w:t>
+      </w:r>
+      <w:r>
+        <w:t xml:space="preserve">Rieger TR, Allen RJ, Bystricky L, Chen Y, Colopy GW, Cui Y, et al. Improving the generation and selection of virtual populations in quantitative systems pharmacology models. Progress in Biophysics and Molecular Biology. 2018 Nov;Quantitative</w:t>
+      </w:r>
+      <w:r>
+        <w:t xml:space="preserve"> </w:t>
+      </w:r>
+      <w:r>
+        <w:t xml:space="preserve">Systems Pharmacology</w:t>
+      </w:r>
+      <w:r>
+        <w:t xml:space="preserve"> </w:t>
+      </w:r>
+      <w:r>
+        <w:t xml:space="preserve">(</w:t>
+      </w:r>
+      <w:r>
+        <w:t xml:space="preserve">QSP</w:t>
+      </w:r>
+      <w:r>
+        <w:t xml:space="preserve">):</w:t>
+      </w:r>
+      <w:r>
+        <w:t xml:space="preserve"> </w:t>
+      </w:r>
+      <w:r>
+        <w:t xml:space="preserve">Methods</w:t>
+      </w:r>
+      <w:r>
+        <w:t xml:space="preserve"> </w:t>
+      </w:r>
+      <w:r>
+        <w:t xml:space="preserve">and</w:t>
+      </w:r>
+      <w:r>
+        <w:t xml:space="preserve"> </w:t>
+      </w:r>
+      <w:r>
+        <w:t xml:space="preserve">Tools</w:t>
+      </w:r>
+      <w:r>
+        <w:t xml:space="preserve">139:15–22. doi:</w:t>
+      </w:r>
+      <w:hyperlink r:id="rId73">
+        <w:r>
+          <w:rPr>
+            <w:rStyle w:val="Hyperlink"/>
+          </w:rPr>
+          <w:t xml:space="preserve">10.1016/j.pbiomolbio.2018.06.002</w:t>
+        </w:r>
+      </w:hyperlink>
+    </w:p>
+    <w:bookmarkEnd w:id="74"/>
+    <w:bookmarkStart w:id="76" w:name="ref-craigPracticalGuideGeneration2023"/>
+    <w:p>
+      <w:pPr>
+        <w:pStyle w:val="Bibliography"/>
+      </w:pPr>
+      <w:r>
+        <w:t xml:space="preserve">5.</w:t>
+      </w:r>
+      <w:r>
+        <w:t xml:space="preserve"> </w:t>
+      </w:r>
+      <w:r>
+        <w:t xml:space="preserve">	</w:t>
+      </w:r>
+      <w:r>
+        <w:t xml:space="preserve">Craig M, Gevertz JL, Kareva I, Wilkie KP. A practical guide for the generation of model-based virtual clinical trials. Frontiers in Systems Biology. 2023 Jun;3. doi:</w:t>
+      </w:r>
+      <w:hyperlink r:id="rId75">
+        <w:r>
+          <w:rPr>
+            <w:rStyle w:val="Hyperlink"/>
+          </w:rPr>
+          <w:t xml:space="preserve">10.3389/fsysb.2023.1174647</w:t>
+        </w:r>
+      </w:hyperlink>
+    </w:p>
+    <w:bookmarkEnd w:id="76"/>
+    <w:bookmarkStart w:id="78" w:name="X1c5a4f9ad3f5411cd43e369d851a1c31e3b802b"/>
+    <w:p>
+      <w:pPr>
+        <w:pStyle w:val="Bibliography"/>
+      </w:pPr>
+      <w:r>
+        <w:t xml:space="preserve">6.</w:t>
+      </w:r>
+      <w:r>
+        <w:t xml:space="preserve"> </w:t>
+      </w:r>
+      <w:r>
+        <w:t xml:space="preserve">	</w:t>
+      </w:r>
+      <w:r>
+        <w:t xml:space="preserve">Folguera-Blasco N, Boshier FAT, Uatay A, Pichardo-Almarza C, Lai M, Biasetti J, et al. Coupling quantitative systems pharmacology modelling to machine learning and artificial intelligence for drug development: Its</w:t>
+      </w:r>
+      <w:r>
+        <w:t xml:space="preserve"> </w:t>
+      </w:r>
+      <w:r>
+        <w:t xml:space="preserve">pAIns</w:t>
+      </w:r>
+      <w:r>
+        <w:t xml:space="preserve"> </w:t>
+      </w:r>
+      <w:r>
+        <w:t xml:space="preserve">and</w:t>
+      </w:r>
+      <w:r>
+        <w:t xml:space="preserve"> </w:t>
+      </w:r>
+      <w:r>
+        <w:t xml:space="preserve">gAIns</w:t>
+      </w:r>
+      <w:r>
+        <w:t xml:space="preserve">. Frontiers in Systems Biology. 2024 Jul;4. doi:</w:t>
+      </w:r>
+      <w:hyperlink r:id="rId77">
+        <w:r>
+          <w:rPr>
+            <w:rStyle w:val="Hyperlink"/>
+          </w:rPr>
+          <w:t xml:space="preserve">10.3389/fsysb.2024.1380685</w:t>
+        </w:r>
+      </w:hyperlink>
+    </w:p>
+    <w:bookmarkEnd w:id="78"/>
+    <w:bookmarkStart w:id="80" w:name="Xf04452bffb761e20a8d85d7ac9f2324a57864a8"/>
+    <w:p>
+      <w:pPr>
+        <w:pStyle w:val="Bibliography"/>
+      </w:pPr>
+      <w:r>
+        <w:t xml:space="preserve">7.</w:t>
+      </w:r>
+      <w:r>
+        <w:t xml:space="preserve"> </w:t>
+      </w:r>
+      <w:r>
+        <w:t xml:space="preserve">	</w:t>
+      </w:r>
+      <w:r>
+        <w:t xml:space="preserve">Terranova N, Renard D, Shahin MH, Menon S, Cao Y, Hop CECA, et al. Artificial</w:t>
+      </w:r>
+      <w:r>
+        <w:t xml:space="preserve"> </w:t>
+      </w:r>
+      <w:r>
+        <w:t xml:space="preserve">Intelligence</w:t>
+      </w:r>
+      <w:r>
+        <w:t xml:space="preserve"> </w:t>
+      </w:r>
+      <w:r>
+        <w:t xml:space="preserve">for</w:t>
+      </w:r>
+      <w:r>
+        <w:t xml:space="preserve"> </w:t>
+      </w:r>
+      <w:r>
+        <w:t xml:space="preserve">Quantitative Modeling</w:t>
+      </w:r>
+      <w:r>
+        <w:t xml:space="preserve"> </w:t>
+      </w:r>
+      <w:r>
+        <w:t xml:space="preserve">in</w:t>
+      </w:r>
+      <w:r>
+        <w:t xml:space="preserve"> </w:t>
+      </w:r>
+      <w:r>
+        <w:t xml:space="preserve">Drug Discovery</w:t>
+      </w:r>
+      <w:r>
+        <w:t xml:space="preserve"> </w:t>
+      </w:r>
+      <w:r>
+        <w:t xml:space="preserve">and</w:t>
+      </w:r>
+      <w:r>
+        <w:t xml:space="preserve"> </w:t>
+      </w:r>
+      <w:r>
+        <w:t xml:space="preserve">Development</w:t>
+      </w:r>
+      <w:r>
+        <w:t xml:space="preserve">:</w:t>
+      </w:r>
+      <w:r>
+        <w:t xml:space="preserve"> </w:t>
+      </w:r>
+      <w:r>
+        <w:t xml:space="preserve">An Innovation</w:t>
+      </w:r>
+      <w:r>
+        <w:t xml:space="preserve"> </w:t>
+      </w:r>
+      <w:r>
+        <w:t xml:space="preserve">and</w:t>
+      </w:r>
+      <w:r>
+        <w:t xml:space="preserve"> </w:t>
+      </w:r>
+      <w:r>
+        <w:t xml:space="preserve">Quality Consortium Perspective</w:t>
+      </w:r>
+      <w:r>
+        <w:t xml:space="preserve"> </w:t>
+      </w:r>
+      <w:r>
+        <w:t xml:space="preserve">on</w:t>
+      </w:r>
+      <w:r>
+        <w:t xml:space="preserve"> </w:t>
+      </w:r>
+      <w:r>
+        <w:t xml:space="preserve">Use Cases</w:t>
+      </w:r>
+      <w:r>
+        <w:t xml:space="preserve"> </w:t>
+      </w:r>
+      <w:r>
+        <w:t xml:space="preserve">and</w:t>
+      </w:r>
+      <w:r>
+        <w:t xml:space="preserve"> </w:t>
+      </w:r>
+      <w:r>
+        <w:t xml:space="preserve">Best Practices</w:t>
+      </w:r>
+      <w:r>
+        <w:t xml:space="preserve">. Clinical Pharmacology &amp; Therapeutics. 2024;115(4):658–72. doi:</w:t>
+      </w:r>
+      <w:hyperlink r:id="rId79">
+        <w:r>
+          <w:rPr>
+            <w:rStyle w:val="Hyperlink"/>
+          </w:rPr>
+          <w:t xml:space="preserve">10.1002/cpt.3053</w:t>
+        </w:r>
+      </w:hyperlink>
+    </w:p>
+    <w:bookmarkEnd w:id="80"/>
+    <w:bookmarkStart w:id="83" w:name="X723aaa622dba1924fafa92c7b97217b2f286bab"/>
+    <w:p>
+      <w:pPr>
+        <w:pStyle w:val="Bibliography"/>
+      </w:pPr>
+      <w:r>
+        <w:t xml:space="preserve">8.</w:t>
+      </w:r>
+      <w:r>
+        <w:t xml:space="preserve"> </w:t>
+      </w:r>
+      <w:r>
+        <w:t xml:space="preserve">	</w:t>
+      </w:r>
+      <w:r>
+        <w:t xml:space="preserve">Goryanin I, Goryanin I, Demin O. Revolutionizing drug discovery:</w:t>
+      </w:r>
+      <w:r>
+        <w:t xml:space="preserve"> </w:t>
+      </w:r>
+      <w:r>
+        <w:t xml:space="preserve">Integrating</w:t>
+      </w:r>
+      <w:r>
+        <w:t xml:space="preserve"> </w:t>
+      </w:r>
+      <w:r>
+        <w:t xml:space="preserve">artificial intelligence with quantitative systems pharmacology. Drug Discovery Today. 2025 Sep;30(9):104448. doi:</w:t>
+      </w:r>
+      <w:hyperlink r:id="rId81">
+        <w:r>
+          <w:rPr>
+            <w:rStyle w:val="Hyperlink"/>
+          </w:rPr>
+          <w:t xml:space="preserve">10.1016/j.drudis.2025.104448</w:t>
+        </w:r>
+      </w:hyperlink>
+      <w:r>
+        <w:t xml:space="preserve"> </w:t>
+      </w:r>
+      <w:r>
+        <w:t xml:space="preserve">PubMed PMID:</w:t>
+      </w:r>
+      <w:r>
+        <w:t xml:space="preserve"> </w:t>
+      </w:r>
+      <w:hyperlink r:id="rId82">
+        <w:r>
+          <w:rPr>
+            <w:rStyle w:val="Hyperlink"/>
+          </w:rPr>
+          <w:t xml:space="preserve">40774584</w:t>
+        </w:r>
+      </w:hyperlink>
+      <w:r>
+        <w:t xml:space="preserve">.</w:t>
+      </w:r>
+    </w:p>
+    <w:bookmarkEnd w:id="83"/>
+    <w:bookmarkStart w:id="85" w:name="ref-androulakisDawnNewEra2025"/>
+    <w:p>
+      <w:pPr>
+        <w:pStyle w:val="Bibliography"/>
+      </w:pPr>
+      <w:r>
+        <w:t xml:space="preserve">9.</w:t>
+      </w:r>
+      <w:r>
+        <w:t xml:space="preserve"> </w:t>
+      </w:r>
+      <w:r>
+        <w:t xml:space="preserve">	</w:t>
+      </w:r>
+      <w:r>
+        <w:t xml:space="preserve">Androulakis IP, Cucurull-Sanchez L, Kondic A, Mehta K, Pichardo C, Pryor M, et al. The dawn of a new era: Can machine learning and large language models reshape</w:t>
+      </w:r>
+      <w:r>
+        <w:t xml:space="preserve"> </w:t>
+      </w:r>
+      <w:r>
+        <w:t xml:space="preserve">QSP</w:t>
+      </w:r>
+      <w:r>
+        <w:t xml:space="preserve"> </w:t>
+      </w:r>
+      <w:r>
+        <w:t xml:space="preserve">modeling? Journal of Pharmacokinetics and Pharmacodynamics. 2025 Jun;52(4):36. doi:</w:t>
+      </w:r>
+      <w:hyperlink r:id="rId84">
+        <w:r>
+          <w:rPr>
+            <w:rStyle w:val="Hyperlink"/>
+          </w:rPr>
+          <w:t xml:space="preserve">10.1007/s10928-025-09984-5</w:t>
+        </w:r>
+      </w:hyperlink>
+    </w:p>
+    <w:bookmarkEnd w:id="85"/>
+    <w:bookmarkStart w:id="88" w:name="X8c415a993717a716f25d3c033f922e736091439"/>
+    <w:p>
+      <w:pPr>
+        <w:pStyle w:val="Bibliography"/>
+      </w:pPr>
+      <w:r>
+        <w:t xml:space="preserve">10.</w:t>
+      </w:r>
+      <w:r>
+        <w:t xml:space="preserve"> </w:t>
+      </w:r>
+      <w:r>
+        <w:t xml:space="preserve">	</w:t>
+      </w:r>
+      <w:r>
+        <w:t xml:space="preserve">Androulakis IP, Cheng L, Cho CR, Zhang T. Leveraging large language models to compare perspectives on integrating</w:t>
+      </w:r>
+      <w:r>
+        <w:t xml:space="preserve"> </w:t>
+      </w:r>
+      <w:r>
+        <w:t xml:space="preserve">QSP</w:t>
+      </w:r>
+      <w:r>
+        <w:t xml:space="preserve"> </w:t>
+      </w:r>
+      <w:r>
+        <w:t xml:space="preserve">and</w:t>
+      </w:r>
+      <w:r>
+        <w:t xml:space="preserve"> </w:t>
+      </w:r>
+      <w:r>
+        <w:t xml:space="preserve">AI</w:t>
+      </w:r>
+      <w:r>
+        <w:t xml:space="preserve">/</w:t>
+      </w:r>
+      <w:r>
+        <w:t xml:space="preserve">ML</w:t>
+      </w:r>
+      <w:r>
+        <w:t xml:space="preserve">. Journal of Pharmacokinetics and Pharmacodynamics. 2025 May;52(3):29. doi:</w:t>
+      </w:r>
+      <w:hyperlink r:id="rId86">
+        <w:r>
+          <w:rPr>
+            <w:rStyle w:val="Hyperlink"/>
+          </w:rPr>
+          <w:t xml:space="preserve">10.1007/s10928-025-09976-5</w:t>
+        </w:r>
+      </w:hyperlink>
+      <w:r>
+        <w:t xml:space="preserve"> </w:t>
+      </w:r>
+      <w:r>
+        <w:t xml:space="preserve">PubMed PMID:</w:t>
+      </w:r>
+      <w:r>
+        <w:t xml:space="preserve"> </w:t>
+      </w:r>
+      <w:hyperlink r:id="rId87">
+        <w:r>
+          <w:rPr>
+            <w:rStyle w:val="Hyperlink"/>
+          </w:rPr>
+          <w:t xml:space="preserve">40325298</w:t>
+        </w:r>
+      </w:hyperlink>
+      <w:r>
+        <w:t xml:space="preserve">.</w:t>
+      </w:r>
+    </w:p>
+    <w:bookmarkEnd w:id="88"/>
+    <w:bookmarkStart w:id="90" w:name="ref-zhaoRecentAdvancesBiomedical2021"/>
+    <w:p>
+      <w:pPr>
+        <w:pStyle w:val="Bibliography"/>
+      </w:pPr>
+      <w:r>
+        <w:t xml:space="preserve">11.</w:t>
+      </w:r>
+      <w:r>
+        <w:t xml:space="preserve"> </w:t>
+      </w:r>
+      <w:r>
+        <w:t xml:space="preserve">	</w:t>
+      </w:r>
+      <w:r>
+        <w:t xml:space="preserve">Zhao S, Su C, Lu Z, Wang F. Recent advances in biomedical literature mining. Briefings in Bioinformatics. 2021 May;22(3):bbaa057. doi:</w:t>
+      </w:r>
+      <w:hyperlink r:id="rId89">
+        <w:r>
+          <w:rPr>
+            <w:rStyle w:val="Hyperlink"/>
+          </w:rPr>
+          <w:t xml:space="preserve">10.1093/bib/bbaa057</w:t>
+        </w:r>
+      </w:hyperlink>
+    </w:p>
+    <w:bookmarkEnd w:id="90"/>
+    <w:bookmarkStart w:id="92" w:name="ref-huAccurateMedicalNamed2024"/>
+    <w:p>
+      <w:pPr>
+        <w:pStyle w:val="Bibliography"/>
+      </w:pPr>
+      <w:r>
+        <w:t xml:space="preserve">12.</w:t>
+      </w:r>
+      <w:r>
+        <w:t xml:space="preserve"> </w:t>
+      </w:r>
+      <w:r>
+        <w:t xml:space="preserve">	</w:t>
+      </w:r>
+      <w:r>
+        <w:t xml:space="preserve">Hu J, Bao R, Lin Y, Zhang H, Xiang Y. Accurate</w:t>
+      </w:r>
+      <w:r>
+        <w:t xml:space="preserve"> </w:t>
+      </w:r>
+      <w:r>
+        <w:t xml:space="preserve">Medical Named Entity Recognition Through Specialized NLP Models</w:t>
+      </w:r>
+      <w:r>
+        <w:t xml:space="preserve">. arXiv preprint arXiv:241208255. 2024 Dec. doi:</w:t>
+      </w:r>
+      <w:hyperlink r:id="rId91">
+        <w:r>
+          <w:rPr>
+            <w:rStyle w:val="Hyperlink"/>
+          </w:rPr>
+          <w:t xml:space="preserve">10.48550/arXiv.2412.08255</w:t>
+        </w:r>
+      </w:hyperlink>
+    </w:p>
+    <w:bookmarkEnd w:id="92"/>
+    <w:bookmarkStart w:id="94" w:name="X2f6b6eadf1efbef9100880a05728250484d836f"/>
+    <w:p>
+      <w:pPr>
+        <w:pStyle w:val="Bibliography"/>
+      </w:pPr>
+      <w:r>
+        <w:t xml:space="preserve">13.</w:t>
+      </w:r>
+      <w:r>
+        <w:t xml:space="preserve"> </w:t>
+      </w:r>
+      <w:r>
+        <w:t xml:space="preserve">	</w:t>
+      </w:r>
+      <w:r>
+        <w:t xml:space="preserve">Gonzalez Hernandez F, Nguyen Q, Smith VC, Cordero JA, Ballester MR, Duran M, et al. Named entity recognition of pharmacokinetic parameters in the scientific literature. Scientific Reports. 2024 Oct;14(1):23485. doi:</w:t>
+      </w:r>
+      <w:hyperlink r:id="rId93">
+        <w:r>
+          <w:rPr>
+            <w:rStyle w:val="Hyperlink"/>
+          </w:rPr>
+          <w:t xml:space="preserve">10.1038/s41598-024-73338-3</w:t>
+        </w:r>
+      </w:hyperlink>
+    </w:p>
+    <w:bookmarkEnd w:id="94"/>
+    <w:bookmarkStart w:id="96" w:name="ref-heAIpoweredImmuneCell2026"/>
+    <w:p>
+      <w:pPr>
+        <w:pStyle w:val="Bibliography"/>
+      </w:pPr>
+      <w:r>
+        <w:t xml:space="preserve">14.</w:t>
+      </w:r>
+      <w:r>
+        <w:t xml:space="preserve"> </w:t>
+      </w:r>
+      <w:r>
+        <w:t xml:space="preserve">	</w:t>
+      </w:r>
+      <w:r>
+        <w:t xml:space="preserve">He S, Tan Y, Ye Q, M Gubin M, Dede M, Rafei H, et al.</w:t>
+      </w:r>
+      <w:r>
+        <w:t xml:space="preserve"> </w:t>
+      </w:r>
+      <w:r>
+        <w:t xml:space="preserve">AI-powered Immune Cell Knowledge Graph</w:t>
+      </w:r>
+      <w:r>
+        <w:t xml:space="preserve"> </w:t>
+      </w:r>
+      <w:r>
+        <w:t xml:space="preserve">(</w:t>
+      </w:r>
+      <w:r>
+        <w:t xml:space="preserve">ICKG</w:t>
+      </w:r>
+      <w:r>
+        <w:t xml:space="preserve">) with granular immune contexts enables immune program interpretation. npj Artificial Intelligence. 2026 Jan;2(1):13. doi:</w:t>
+      </w:r>
+      <w:hyperlink r:id="rId95">
+        <w:r>
+          <w:rPr>
+            <w:rStyle w:val="Hyperlink"/>
+          </w:rPr>
+          <w:t xml:space="preserve">10.1038/s44387-025-00060-4</w:t>
+        </w:r>
+      </w:hyperlink>
+    </w:p>
+    <w:bookmarkEnd w:id="96"/>
+    <w:bookmarkStart w:id="100" w:name="ref-khanCollaborativeLargeLanguage2024"/>
+    <w:p>
+      <w:pPr>
+        <w:pStyle w:val="Bibliography"/>
+      </w:pPr>
+      <w:r>
+        <w:t xml:space="preserve">15.</w:t>
+      </w:r>
+      <w:r>
+        <w:t xml:space="preserve"> </w:t>
+      </w:r>
+      <w:r>
+        <w:t xml:space="preserve">	</w:t>
+      </w:r>
+      <w:r>
+        <w:t xml:space="preserve">Khan MA, Ayub U, Naqvi SAA, Khakwani KZR, Sipra ZBR, Raina A, et al. Collaborative</w:t>
+      </w:r>
+      <w:r>
+        <w:t xml:space="preserve"> </w:t>
+      </w:r>
+      <w:r>
+        <w:t xml:space="preserve">Large Language Models</w:t>
+      </w:r>
+      <w:r>
+        <w:t xml:space="preserve"> </w:t>
+      </w:r>
+      <w:r>
+        <w:t xml:space="preserve">for</w:t>
+      </w:r>
+      <w:r>
+        <w:t xml:space="preserve"> </w:t>
+      </w:r>
+      <w:r>
+        <w:t xml:space="preserve">Automated Data Extraction</w:t>
+      </w:r>
+      <w:r>
+        <w:t xml:space="preserve"> </w:t>
+      </w:r>
+      <w:r>
+        <w:t xml:space="preserve">in</w:t>
+      </w:r>
+      <w:r>
+        <w:t xml:space="preserve"> </w:t>
+      </w:r>
+      <w:r>
+        <w:t xml:space="preserve">Living Systematic Reviews</w:t>
+      </w:r>
+      <w:r>
+        <w:t xml:space="preserve">. medRxiv: The Preprint Server for Health Sciences. 2024 Sep;2024.09.20.24314108. doi:</w:t>
+      </w:r>
+      <w:hyperlink r:id="rId97">
+        <w:r>
+          <w:rPr>
+            <w:rStyle w:val="Hyperlink"/>
+          </w:rPr>
+          <w:t xml:space="preserve">10.1101/2024.09.20.24314108</w:t>
+        </w:r>
+      </w:hyperlink>
+      <w:r>
+        <w:t xml:space="preserve"> </w:t>
+      </w:r>
+      <w:r>
+        <w:t xml:space="preserve">PubMed PMID:</w:t>
+      </w:r>
+      <w:r>
+        <w:t xml:space="preserve"> </w:t>
+      </w:r>
+      <w:hyperlink r:id="rId98">
+        <w:r>
+          <w:rPr>
+            <w:rStyle w:val="Hyperlink"/>
+          </w:rPr>
+          <w:t xml:space="preserve">39399004</w:t>
+        </w:r>
+      </w:hyperlink>
+      <w:r>
+        <w:t xml:space="preserve">; PubMed Central PMCID:</w:t>
+      </w:r>
+      <w:r>
+        <w:t xml:space="preserve"> </w:t>
+      </w:r>
+      <w:hyperlink r:id="rId99">
+        <w:r>
+          <w:rPr>
+            <w:rStyle w:val="Hyperlink"/>
+          </w:rPr>
+          <w:t xml:space="preserve">PMC11469465</w:t>
+        </w:r>
+      </w:hyperlink>
+      <w:r>
+        <w:t xml:space="preserve">.</w:t>
+      </w:r>
+    </w:p>
+    <w:bookmarkEnd w:id="100"/>
+    <w:bookmarkStart w:id="102" w:name="X1029472ca037a74b06f54723d7b391db09d7c53"/>
+    <w:p>
+      <w:pPr>
+        <w:pStyle w:val="Bibliography"/>
+      </w:pPr>
+      <w:r>
+        <w:t xml:space="preserve">16.</w:t>
+      </w:r>
+      <w:r>
+        <w:t xml:space="preserve"> </w:t>
+      </w:r>
+      <w:r>
+        <w:t xml:space="preserve">	</w:t>
+      </w:r>
+      <w:r>
+        <w:t xml:space="preserve">Saini A, Farnoud A.</w:t>
+      </w:r>
+      <w:r>
+        <w:t xml:space="preserve"> </w:t>
+      </w:r>
+      <w:r>
+        <w:t xml:space="preserve">QSP-Copilot</w:t>
+      </w:r>
+      <w:r>
+        <w:t xml:space="preserve">:</w:t>
+      </w:r>
+      <w:r>
+        <w:t xml:space="preserve"> </w:t>
+      </w:r>
+      <w:r>
+        <w:t xml:space="preserve">An AI-Augmented Platform</w:t>
+      </w:r>
+      <w:r>
+        <w:t xml:space="preserve"> </w:t>
+      </w:r>
+      <w:r>
+        <w:t xml:space="preserve">for</w:t>
+      </w:r>
+      <w:r>
+        <w:t xml:space="preserve"> </w:t>
+      </w:r>
+      <w:r>
+        <w:t xml:space="preserve">Accelerating Quantitative Systems Pharmacology Model Development</w:t>
+      </w:r>
+      <w:r>
+        <w:t xml:space="preserve">. CPT: Pharmacometrics &amp; Systems Pharmacology. 2025;14(11):1775–86. doi:</w:t>
+      </w:r>
+      <w:hyperlink r:id="rId101">
+        <w:r>
+          <w:rPr>
+            <w:rStyle w:val="Hyperlink"/>
+          </w:rPr>
+          <w:t xml:space="preserve">10.1002/psp4.70127</w:t>
+        </w:r>
+      </w:hyperlink>
+    </w:p>
+    <w:bookmarkEnd w:id="102"/>
+    <w:bookmarkStart w:id="104" w:name="ref-hsuLLMIEPythonPackage2025"/>
+    <w:p>
+      <w:pPr>
+        <w:pStyle w:val="Bibliography"/>
+      </w:pPr>
+      <w:r>
+        <w:t xml:space="preserve">17.</w:t>
+      </w:r>
+      <w:r>
+        <w:t xml:space="preserve"> </w:t>
+      </w:r>
+      <w:r>
+        <w:t xml:space="preserve">	</w:t>
+      </w:r>
+      <w:r>
+        <w:t xml:space="preserve">Hsu E, Roberts K.</w:t>
+      </w:r>
+      <w:r>
+        <w:t xml:space="preserve"> </w:t>
+      </w:r>
+      <w:r>
+        <w:t xml:space="preserve">LLM-IE</w:t>
+      </w:r>
+      <w:r>
+        <w:t xml:space="preserve">: A python package for biomedical generative information extraction with large language models. JAMIA Open. 2025 Apr;8(2):ooaf012. doi:</w:t>
+      </w:r>
+      <w:hyperlink r:id="rId103">
+        <w:r>
+          <w:rPr>
+            <w:rStyle w:val="Hyperlink"/>
+          </w:rPr>
+          <w:t xml:space="preserve">10.1093/jamiaopen/ooaf012</w:t>
+        </w:r>
+      </w:hyperlink>
+    </w:p>
+    <w:bookmarkEnd w:id="104"/>
+    <w:bookmarkStart w:id="106" w:name="X80b850b1fae475c21ff68b6cd4ad6c287df98b4"/>
+    <w:p>
+      <w:pPr>
+        <w:pStyle w:val="Bibliography"/>
+      </w:pPr>
+      <w:r>
+        <w:t xml:space="preserve">18.</w:t>
+      </w:r>
+      <w:r>
+        <w:t xml:space="preserve"> </w:t>
+      </w:r>
+      <w:r>
+        <w:t xml:space="preserve">	</w:t>
+      </w:r>
+      <w:r>
+        <w:t xml:space="preserve">Wang X, Huey SL, Sheng R, Mehta S, Wang F.</w:t>
+      </w:r>
+      <w:r>
+        <w:t xml:space="preserve"> </w:t>
+      </w:r>
+      <w:r>
+        <w:t xml:space="preserve">SciDaSynth</w:t>
+      </w:r>
+      <w:r>
+        <w:t xml:space="preserve">:</w:t>
+      </w:r>
+      <w:r>
+        <w:t xml:space="preserve"> </w:t>
+      </w:r>
+      <w:r>
+        <w:t xml:space="preserve">Interactive Structured Data Extraction From Scientific Literature With Large Language Model</w:t>
+      </w:r>
+      <w:r>
+        <w:t xml:space="preserve">. Campbell Systematic Reviews. 2025;21(4):e70073. doi:</w:t>
+      </w:r>
+      <w:hyperlink r:id="rId105">
+        <w:r>
+          <w:rPr>
+            <w:rStyle w:val="Hyperlink"/>
+          </w:rPr>
+          <w:t xml:space="preserve">10.1002/cl2.70073</w:t>
+        </w:r>
+      </w:hyperlink>
+    </w:p>
+    <w:bookmarkEnd w:id="106"/>
+    <w:bookmarkStart w:id="108" w:name="X1c94f764c1b19aacc24a132bd09663de20b324f"/>
+    <w:p>
+      <w:pPr>
+        <w:pStyle w:val="Bibliography"/>
+      </w:pPr>
+      <w:r>
+        <w:t xml:space="preserve">19.</w:t>
+      </w:r>
+      <w:r>
+        <w:t xml:space="preserve"> </w:t>
+      </w:r>
+      <w:r>
+        <w:t xml:space="preserve">	</w:t>
+      </w:r>
+      <w:r>
+        <w:t xml:space="preserve">Farquhar S, Kossen J, Kuhn L, Gal Y. Detecting hallucinations in large language models using semantic entropy. Nature. 2024 Jun;630(8017):625–30. doi:</w:t>
+      </w:r>
+      <w:hyperlink r:id="rId107">
+        <w:r>
+          <w:rPr>
+            <w:rStyle w:val="Hyperlink"/>
+          </w:rPr>
+          <w:t xml:space="preserve">10.1038/s41586-024-07421-0</w:t>
+        </w:r>
+      </w:hyperlink>
+    </w:p>
+    <w:bookmarkEnd w:id="108"/>
+    <w:bookmarkStart w:id="110" w:name="ref-huangSurveyHallucinationLarge2025"/>
+    <w:p>
+      <w:pPr>
+        <w:pStyle w:val="Bibliography"/>
+      </w:pPr>
+      <w:r>
+        <w:t xml:space="preserve">20.</w:t>
+      </w:r>
+      <w:r>
+        <w:t xml:space="preserve"> </w:t>
+      </w:r>
+      <w:r>
+        <w:t xml:space="preserve">	</w:t>
+      </w:r>
+      <w:r>
+        <w:t xml:space="preserve">Huang L, Yu W, Ma W, Zhong W, Feng Z, Wang H, et al. A</w:t>
+      </w:r>
+      <w:r>
+        <w:t xml:space="preserve"> </w:t>
+      </w:r>
+      <w:r>
+        <w:t xml:space="preserve">Survey</w:t>
+      </w:r>
+      <w:r>
+        <w:t xml:space="preserve"> </w:t>
+      </w:r>
+      <w:r>
+        <w:t xml:space="preserve">on</w:t>
+      </w:r>
+      <w:r>
+        <w:t xml:space="preserve"> </w:t>
+      </w:r>
+      <w:r>
+        <w:t xml:space="preserve">Hallucination</w:t>
+      </w:r>
+      <w:r>
+        <w:t xml:space="preserve"> </w:t>
+      </w:r>
+      <w:r>
+        <w:t xml:space="preserve">in</w:t>
+      </w:r>
+      <w:r>
+        <w:t xml:space="preserve"> </w:t>
+      </w:r>
+      <w:r>
+        <w:t xml:space="preserve">Large Language Models</w:t>
+      </w:r>
+      <w:r>
+        <w:t xml:space="preserve">:</w:t>
+      </w:r>
+      <w:r>
+        <w:t xml:space="preserve"> </w:t>
+      </w:r>
+      <w:r>
+        <w:t xml:space="preserve">Principles</w:t>
+      </w:r>
+      <w:r>
+        <w:t xml:space="preserve">,</w:t>
+      </w:r>
+      <w:r>
+        <w:t xml:space="preserve"> </w:t>
+      </w:r>
+      <w:r>
+        <w:t xml:space="preserve">Taxonomy</w:t>
+      </w:r>
+      <w:r>
+        <w:t xml:space="preserve">,</w:t>
+      </w:r>
+      <w:r>
+        <w:t xml:space="preserve"> </w:t>
+      </w:r>
+      <w:r>
+        <w:t xml:space="preserve">Challenges</w:t>
+      </w:r>
+      <w:r>
+        <w:t xml:space="preserve">, and</w:t>
+      </w:r>
+      <w:r>
+        <w:t xml:space="preserve"> </w:t>
+      </w:r>
+      <w:r>
+        <w:t xml:space="preserve">Open Questions</w:t>
+      </w:r>
+      <w:r>
+        <w:t xml:space="preserve">. ACM Transactions on Information Systems. 2025 Mar;43(2):1–55. doi:</w:t>
+      </w:r>
+      <w:hyperlink r:id="rId109">
+        <w:r>
+          <w:rPr>
+            <w:rStyle w:val="Hyperlink"/>
+          </w:rPr>
+          <w:t xml:space="preserve">10.1145/3703155</w:t>
+        </w:r>
+      </w:hyperlink>
+    </w:p>
+    <w:bookmarkEnd w:id="110"/>
+    <w:bookmarkStart w:id="113" w:name="Xa1423de0e5574a091a8a2397c71c4dc91c30f4b"/>
+    <w:p>
+      <w:pPr>
+        <w:pStyle w:val="Bibliography"/>
+      </w:pPr>
+      <w:r>
+        <w:t xml:space="preserve">21.</w:t>
+      </w:r>
+      <w:r>
+        <w:t xml:space="preserve"> </w:t>
+      </w:r>
+      <w:r>
+        <w:t xml:space="preserve">	</w:t>
+      </w:r>
+      <w:r>
+        <w:t xml:space="preserve">Pandit S, Xu J, Hong J, Wang Z, Chen T, Xu K, et al.</w:t>
+      </w:r>
+      <w:r>
+        <w:t xml:space="preserve"> </w:t>
+      </w:r>
+      <w:r>
+        <w:t xml:space="preserve">MedHallu</w:t>
+      </w:r>
+      <w:r>
+        <w:t xml:space="preserve">:</w:t>
+      </w:r>
+      <w:r>
+        <w:t xml:space="preserve"> </w:t>
+      </w:r>
+      <w:r>
+        <w:t xml:space="preserve">A Comprehensive Benchmark</w:t>
+      </w:r>
+      <w:r>
+        <w:t xml:space="preserve"> </w:t>
+      </w:r>
+      <w:r>
+        <w:t xml:space="preserve">for</w:t>
+      </w:r>
+      <w:r>
+        <w:t xml:space="preserve"> </w:t>
+      </w:r>
+      <w:r>
+        <w:t xml:space="preserve">Detecting Medical Hallucinations</w:t>
+      </w:r>
+      <w:r>
+        <w:t xml:space="preserve"> </w:t>
+      </w:r>
+      <w:r>
+        <w:t xml:space="preserve">in</w:t>
+      </w:r>
+      <w:r>
+        <w:t xml:space="preserve"> </w:t>
+      </w:r>
+      <w:r>
+        <w:t xml:space="preserve">Large Language Models</w:t>
+      </w:r>
+      <w:r>
+        <w:t xml:space="preserve"> </w:t>
+      </w:r>
+      <w:r>
+        <w:t xml:space="preserve">[Internet]. arXiv; 2025 [cited 2026 Jan 20]. Available from:</w:t>
+      </w:r>
+      <w:r>
+        <w:t xml:space="preserve"> </w:t>
+      </w:r>
+      <w:hyperlink r:id="rId111">
+        <w:r>
+          <w:rPr>
+            <w:rStyle w:val="Hyperlink"/>
+          </w:rPr>
+          <w:t xml:space="preserve">https://arxiv.org/abs/2502.14302</w:t>
+        </w:r>
+      </w:hyperlink>
+      <w:r>
+        <w:t xml:space="preserve"> </w:t>
+      </w:r>
+      <w:r>
+        <w:t xml:space="preserve">doi:</w:t>
+      </w:r>
+      <w:hyperlink r:id="rId112">
+        <w:r>
+          <w:rPr>
+            <w:rStyle w:val="Hyperlink"/>
+          </w:rPr>
+          <w:t xml:space="preserve">10.48550/arXiv.2502.14302</w:t>
+        </w:r>
+      </w:hyperlink>
+    </w:p>
+    <w:bookmarkEnd w:id="113"/>
+    <w:bookmarkStart w:id="115" w:name="ref-Colvin_Pydantic_Validation_2025"/>
+    <w:p>
+      <w:pPr>
+        <w:pStyle w:val="Bibliography"/>
+      </w:pPr>
+      <w:r>
+        <w:t xml:space="preserve">22.</w:t>
+      </w:r>
+      <w:r>
+        <w:t xml:space="preserve"> </w:t>
+      </w:r>
+      <w:r>
+        <w:t xml:space="preserve">	</w:t>
+      </w:r>
+      <w:r>
+        <w:t xml:space="preserve">Colvin S, Jolibois E, Ramezani H, Garcia Badaracco A, Dorsey T, Montague D, et al.</w:t>
+      </w:r>
+      <w:r>
+        <w:t xml:space="preserve"> </w:t>
       </w:r>
       <w:r>
         <w:t xml:space="preserve">Pydantic Validation</w:t>
       </w:r>
       <w:r>
-        <w:t xml:space="preserve">.”</w:t>
-      </w:r>
-      <w:r>
-        <w:t xml:space="preserve"> </w:t>
-      </w:r>
-      <w:hyperlink r:id="rId66">
+        <w:t xml:space="preserve"> </w:t>
+      </w:r>
+      <w:r>
+        <w:t xml:space="preserve">[Internet]. 2025. Available from:</w:t>
+      </w:r>
+      <w:r>
+        <w:t xml:space="preserve"> </w:t>
+      </w:r>
+      <w:hyperlink r:id="rId114">
         <w:r>
           <w:rPr>
             <w:rStyle w:val="Hyperlink"/>
@@ -3958,122 +5166,147 @@
           <w:t xml:space="preserve">https://github.com/pydantic/pydantic</w:t>
         </w:r>
       </w:hyperlink>
-      <w:r>
-        <w:t xml:space="preserve">.</w:t>
-      </w:r>
-    </w:p>
-    <w:bookmarkEnd w:id="67"/>
-    <w:bookmarkStart w:id="69" w:name="ref-craigPracticalGuideGeneration2023"/>
+    </w:p>
+    <w:bookmarkEnd w:id="115"/>
+    <w:bookmarkStart w:id="117" w:name="ref-Grecco_Pint_2025"/>
     <w:p>
       <w:pPr>
         <w:pStyle w:val="Bibliography"/>
       </w:pPr>
       <w:r>
-        <w:t xml:space="preserve">Craig, Morgan, Jana L. Gevertz, Irina Kareva, and Kathleen P. Wilkie. 2023.</w:t>
-      </w:r>
-      <w:r>
-        <w:t xml:space="preserve"> </w:t>
-      </w:r>
-      <w:r>
-        <w:t xml:space="preserve">“A Practical Guide for the Generation of Model-Based Virtual Clinical Trials.”</w:t>
-      </w:r>
-      <w:r>
-        <w:t xml:space="preserve"> </w:t>
-      </w:r>
-      <w:r>
-        <w:rPr>
-          <w:i/>
-          <w:iCs/>
-        </w:rPr>
-        <w:t xml:space="preserve">Frontiers in Systems Biology</w:t>
-      </w:r>
-      <w:r>
-        <w:t xml:space="preserve"> </w:t>
-      </w:r>
-      <w:r>
-        <w:t xml:space="preserve">3 (June).</w:t>
-      </w:r>
-      <w:r>
-        <w:t xml:space="preserve"> </w:t>
-      </w:r>
-      <w:hyperlink r:id="rId68">
+        <w:t xml:space="preserve">23.</w:t>
+      </w:r>
+      <w:r>
+        <w:t xml:space="preserve"> </w:t>
+      </w:r>
+      <w:r>
+        <w:t xml:space="preserve">	</w:t>
+      </w:r>
+      <w:r>
+        <w:t xml:space="preserve">Grecco HE.</w:t>
+      </w:r>
+      <w:r>
+        <w:t xml:space="preserve"> </w:t>
+      </w:r>
+      <w:r>
+        <w:t xml:space="preserve">Pint: Operate and manipulate physical quantities in Python</w:t>
+      </w:r>
+      <w:r>
+        <w:t xml:space="preserve"> </w:t>
+      </w:r>
+      <w:r>
+        <w:t xml:space="preserve">[Internet]. 2025. Available from:</w:t>
+      </w:r>
+      <w:r>
+        <w:t xml:space="preserve"> </w:t>
+      </w:r>
+      <w:hyperlink r:id="rId116">
         <w:r>
           <w:rPr>
             <w:rStyle w:val="Hyperlink"/>
           </w:rPr>
-          <w:t xml:space="preserve">https://doi.org/10.3389/fsysb.2023.1174647</w:t>
+          <w:t xml:space="preserve">https://github.com/hgrecco/pint</w:t>
         </w:r>
       </w:hyperlink>
-      <w:r>
-        <w:t xml:space="preserve">.</w:t>
-      </w:r>
-    </w:p>
-    <w:bookmarkEnd w:id="69"/>
-    <w:bookmarkStart w:id="71" w:name="X1c94f764c1b19aacc24a132bd09663de20b324f"/>
+    </w:p>
+    <w:bookmarkEnd w:id="117"/>
+    <w:bookmarkStart w:id="119" w:name="ref-Pydantic_Logfire_2025"/>
     <w:p>
       <w:pPr>
         <w:pStyle w:val="Bibliography"/>
       </w:pPr>
       <w:r>
-        <w:t xml:space="preserve">Farquhar, Sebastian, Jannik Kossen, Lorenz Kuhn, and Yarin Gal. 2024.</w:t>
-      </w:r>
-      <w:r>
-        <w:t xml:space="preserve"> </w:t>
-      </w:r>
-      <w:r>
-        <w:t xml:space="preserve">“Detecting Hallucinations in Large Language Models Using Semantic Entropy.”</w:t>
-      </w:r>
-      <w:r>
-        <w:t xml:space="preserve"> </w:t>
-      </w:r>
-      <w:r>
-        <w:rPr>
-          <w:i/>
-          <w:iCs/>
-        </w:rPr>
-        <w:t xml:space="preserve">Nature</w:t>
-      </w:r>
-      <w:r>
-        <w:t xml:space="preserve"> </w:t>
-      </w:r>
-      <w:r>
-        <w:t xml:space="preserve">630 (8017): 625–30.</w:t>
-      </w:r>
-      <w:r>
-        <w:t xml:space="preserve"> </w:t>
-      </w:r>
-      <w:hyperlink r:id="rId70">
+        <w:t xml:space="preserve">24.</w:t>
+      </w:r>
+      <w:r>
+        <w:t xml:space="preserve"> </w:t>
+      </w:r>
+      <w:r>
+        <w:t xml:space="preserve">	</w:t>
+      </w:r>
+      <w:r>
+        <w:t xml:space="preserve">Pydantic.</w:t>
+      </w:r>
+      <w:r>
+        <w:t xml:space="preserve"> </w:t>
+      </w:r>
+      <w:r>
+        <w:t xml:space="preserve">Logfire: Observability platform for Python applications</w:t>
+      </w:r>
+      <w:r>
+        <w:t xml:space="preserve"> </w:t>
+      </w:r>
+      <w:r>
+        <w:t xml:space="preserve">[Internet]. 2025. Available from:</w:t>
+      </w:r>
+      <w:r>
+        <w:t xml:space="preserve"> </w:t>
+      </w:r>
+      <w:hyperlink r:id="rId118">
         <w:r>
           <w:rPr>
             <w:rStyle w:val="Hyperlink"/>
           </w:rPr>
-          <w:t xml:space="preserve">https://doi.org/10.1038/s41586-024-07421-0</w:t>
+          <w:t xml:space="preserve">https://pydantic.dev/logfire</w:t>
         </w:r>
       </w:hyperlink>
-      <w:r>
-        <w:t xml:space="preserve">.</w:t>
-      </w:r>
-    </w:p>
-    <w:bookmarkEnd w:id="71"/>
-    <w:bookmarkStart w:id="73" w:name="X1c5a4f9ad3f5411cd43e369d851a1c31e3b802b"/>
+    </w:p>
+    <w:bookmarkEnd w:id="119"/>
+    <w:bookmarkStart w:id="121" w:name="ref-geTuringLanguageFlexible2018"/>
     <w:p>
       <w:pPr>
         <w:pStyle w:val="Bibliography"/>
       </w:pPr>
       <w:r>
-        <w:t xml:space="preserve">Folguera-Blasco, Núria, Florencia A. T. Boshier, Aydar Uatay, Cesar Pichardo-Almarza, Massimo Lai, Jacopo Biasetti, Richard Dearden, Megan Gibbs, and Holly Kimko. 2024.</w:t>
-      </w:r>
-      <w:r>
-        <w:t xml:space="preserve"> </w:t>
-      </w:r>
-      <w:r>
-        <w:t xml:space="preserve">“Coupling Quantitative Systems Pharmacology Modelling to Machine Learning and Artificial Intelligence for Drug Development: Its</w:t>
-      </w:r>
-      <w:r>
-        <w:t xml:space="preserve"> </w:t>
-      </w:r>
-      <w:r>
-        <w:t xml:space="preserve">pAIns</w:t>
+        <w:t xml:space="preserve">25.</w:t>
+      </w:r>
+      <w:r>
+        <w:t xml:space="preserve"> </w:t>
+      </w:r>
+      <w:r>
+        <w:t xml:space="preserve">	</w:t>
+      </w:r>
+      <w:r>
+        <w:t xml:space="preserve">Ge H, Xu K, Ghahramani Z. Turing:</w:t>
+      </w:r>
+      <w:r>
+        <w:t xml:space="preserve"> </w:t>
+      </w:r>
+      <w:r>
+        <w:t xml:space="preserve">A Language</w:t>
+      </w:r>
+      <w:r>
+        <w:t xml:space="preserve"> </w:t>
+      </w:r>
+      <w:r>
+        <w:t xml:space="preserve">for</w:t>
+      </w:r>
+      <w:r>
+        <w:t xml:space="preserve"> </w:t>
+      </w:r>
+      <w:r>
+        <w:t xml:space="preserve">Flexible Probabilistic Inference</w:t>
+      </w:r>
+      <w:r>
+        <w:t xml:space="preserve">. In: Proceedings of the</w:t>
+      </w:r>
+      <w:r>
+        <w:t xml:space="preserve"> </w:t>
+      </w:r>
+      <w:r>
+        <w:t xml:space="preserve">Twenty-First International Conference</w:t>
+      </w:r>
+      <w:r>
+        <w:t xml:space="preserve"> </w:t>
+      </w:r>
+      <w:r>
+        <w:t xml:space="preserve">on</w:t>
+      </w:r>
+      <w:r>
+        <w:t xml:space="preserve"> </w:t>
+      </w:r>
+      <w:r>
+        <w:t xml:space="preserve">Artificial Intelligence</w:t>
       </w:r>
       <w:r>
         <w:t xml:space="preserve"> </w:t>
@@ -4085,314 +5318,18 @@
         <w:t xml:space="preserve"> </w:t>
       </w:r>
       <w:r>
-        <w:t xml:space="preserve">gAIns</w:t>
-      </w:r>
-      <w:r>
-        <w:t xml:space="preserve">.”</w:t>
-      </w:r>
-      <w:r>
-        <w:t xml:space="preserve"> </w:t>
-      </w:r>
-      <w:r>
-        <w:rPr>
-          <w:i/>
-          <w:iCs/>
-        </w:rPr>
-        <w:t xml:space="preserve">Frontiers in Systems Biology</w:t>
-      </w:r>
-      <w:r>
-        <w:t xml:space="preserve"> </w:t>
-      </w:r>
-      <w:r>
-        <w:t xml:space="preserve">4 (July).</w:t>
-      </w:r>
-      <w:r>
-        <w:t xml:space="preserve"> </w:t>
-      </w:r>
-      <w:hyperlink r:id="rId72">
-        <w:r>
-          <w:rPr>
-            <w:rStyle w:val="Hyperlink"/>
-          </w:rPr>
-          <w:t xml:space="preserve">https://doi.org/10.3389/fsysb.2024.1380685</w:t>
-        </w:r>
-      </w:hyperlink>
-      <w:r>
-        <w:t xml:space="preserve">.</w:t>
-      </w:r>
-    </w:p>
-    <w:bookmarkEnd w:id="73"/>
-    <w:bookmarkStart w:id="75" w:name="ref-gadkarSixStageWorkflowRobust2016"/>
-    <w:p>
-      <w:pPr>
-        <w:pStyle w:val="Bibliography"/>
-      </w:pPr>
-      <w:r>
-        <w:t xml:space="preserve">Gadkar, K, DC Kirouac, DE Mager, PH van der Graaf, and S Ramanujan. 2016.</w:t>
-      </w:r>
-      <w:r>
-        <w:t xml:space="preserve"> </w:t>
-      </w:r>
-      <w:r>
-        <w:t xml:space="preserve">“A</w:t>
-      </w:r>
-      <w:r>
-        <w:t xml:space="preserve"> </w:t>
-      </w:r>
-      <w:r>
-        <w:t xml:space="preserve">Six</w:t>
-      </w:r>
-      <w:r>
-        <w:t xml:space="preserve">-</w:t>
-      </w:r>
-      <w:r>
-        <w:t xml:space="preserve">Stage Workflow</w:t>
-      </w:r>
-      <w:r>
-        <w:t xml:space="preserve"> </w:t>
-      </w:r>
-      <w:r>
-        <w:t xml:space="preserve">for</w:t>
-      </w:r>
-      <w:r>
-        <w:t xml:space="preserve"> </w:t>
-      </w:r>
-      <w:r>
-        <w:t xml:space="preserve">Robust Application</w:t>
-      </w:r>
-      <w:r>
-        <w:t xml:space="preserve"> </w:t>
-      </w:r>
-      <w:r>
-        <w:t xml:space="preserve">of</w:t>
-      </w:r>
-      <w:r>
-        <w:t xml:space="preserve"> </w:t>
-      </w:r>
-      <w:r>
-        <w:t xml:space="preserve">Systems Pharmacology</w:t>
-      </w:r>
-      <w:r>
-        <w:t xml:space="preserve">.”</w:t>
-      </w:r>
-      <w:r>
-        <w:t xml:space="preserve"> </w:t>
-      </w:r>
-      <w:r>
-        <w:rPr>
-          <w:i/>
-          <w:iCs/>
-        </w:rPr>
-        <w:t xml:space="preserve">CPT: Pharmacometrics &amp; Systems Pharmacology</w:t>
-      </w:r>
-      <w:r>
-        <w:t xml:space="preserve"> </w:t>
-      </w:r>
-      <w:r>
-        <w:t xml:space="preserve">5 (5): 235–49.</w:t>
-      </w:r>
-      <w:r>
-        <w:t xml:space="preserve"> </w:t>
-      </w:r>
-      <w:hyperlink r:id="rId74">
-        <w:r>
-          <w:rPr>
-            <w:rStyle w:val="Hyperlink"/>
-          </w:rPr>
-          <w:t xml:space="preserve">https://doi.org/10.1002/psp4.12071</w:t>
-        </w:r>
-      </w:hyperlink>
-      <w:r>
-        <w:t xml:space="preserve">.</w:t>
-      </w:r>
-    </w:p>
-    <w:bookmarkEnd w:id="75"/>
-    <w:bookmarkStart w:id="77" w:name="ref-gaoJointExtractionEntity2024"/>
-    <w:p>
-      <w:pPr>
-        <w:pStyle w:val="Bibliography"/>
-      </w:pPr>
-      <w:r>
-        <w:t xml:space="preserve">Gao, Ting, Xue Zhai, Chuan Yang, Linlin Lv, and Han Wang. 2024.</w:t>
-      </w:r>
-      <w:r>
-        <w:t xml:space="preserve"> </w:t>
-      </w:r>
-      <w:r>
-        <w:t xml:space="preserve">“Joint Extraction of Entity and Relation Based on Fine-Tuning</w:t>
-      </w:r>
-      <w:r>
-        <w:t xml:space="preserve"> </w:t>
-      </w:r>
-      <w:r>
-        <w:t xml:space="preserve">BERT</w:t>
-      </w:r>
-      <w:r>
-        <w:t xml:space="preserve"> </w:t>
-      </w:r>
-      <w:r>
-        <w:t xml:space="preserve">for Long Biomedical Literatures.”</w:t>
-      </w:r>
-      <w:r>
-        <w:t xml:space="preserve"> </w:t>
-      </w:r>
-      <w:r>
-        <w:rPr>
-          <w:i/>
-          <w:iCs/>
-        </w:rPr>
-        <w:t xml:space="preserve">Bioinformatics Advances</w:t>
-      </w:r>
-      <w:r>
-        <w:t xml:space="preserve"> </w:t>
-      </w:r>
-      <w:r>
-        <w:t xml:space="preserve">4 (1): vbae194.</w:t>
-      </w:r>
-      <w:r>
-        <w:t xml:space="preserve"> </w:t>
-      </w:r>
-      <w:hyperlink r:id="rId76">
-        <w:r>
-          <w:rPr>
-            <w:rStyle w:val="Hyperlink"/>
-          </w:rPr>
-          <w:t xml:space="preserve">https://doi.org/10.1093/bioadv/vbae194</w:t>
-        </w:r>
-      </w:hyperlink>
-      <w:r>
-        <w:t xml:space="preserve">.</w:t>
-      </w:r>
-    </w:p>
-    <w:bookmarkEnd w:id="77"/>
-    <w:bookmarkStart w:id="79" w:name="ref-geTuringLanguageFlexible2018"/>
-    <w:p>
-      <w:pPr>
-        <w:pStyle w:val="Bibliography"/>
-      </w:pPr>
-      <w:r>
-        <w:t xml:space="preserve">Ge, Hong, Kai Xu, and Zoubin Ghahramani. 2018.</w:t>
-      </w:r>
-      <w:r>
-        <w:t xml:space="preserve"> </w:t>
-      </w:r>
-      <w:r>
-        <w:t xml:space="preserve">“Turing:</w:t>
-      </w:r>
-      <w:r>
-        <w:t xml:space="preserve"> </w:t>
-      </w:r>
-      <w:r>
-        <w:t xml:space="preserve">A Language</w:t>
-      </w:r>
-      <w:r>
-        <w:t xml:space="preserve"> </w:t>
-      </w:r>
-      <w:r>
-        <w:t xml:space="preserve">for</w:t>
-      </w:r>
-      <w:r>
-        <w:t xml:space="preserve"> </w:t>
-      </w:r>
-      <w:r>
-        <w:t xml:space="preserve">Flexible Probabilistic Inference</w:t>
-      </w:r>
-      <w:r>
-        <w:t xml:space="preserve">.”</w:t>
-      </w:r>
-      <w:r>
-        <w:t xml:space="preserve"> </w:t>
-      </w:r>
-      <w:r>
-        <w:t xml:space="preserve">In</w:t>
-      </w:r>
-      <w:r>
-        <w:t xml:space="preserve"> </w:t>
-      </w:r>
-      <w:r>
-        <w:rPr>
-          <w:i/>
-          <w:iCs/>
-        </w:rPr>
-        <w:t xml:space="preserve">Proceedings of the</w:t>
-      </w:r>
-      <w:r>
-        <w:rPr>
-          <w:i/>
-          <w:iCs/>
-        </w:rPr>
-        <w:t xml:space="preserve"> </w:t>
-      </w:r>
-      <w:r>
-        <w:rPr>
-          <w:i/>
-          <w:iCs/>
-        </w:rPr>
-        <w:t xml:space="preserve">Twenty-First International Conference</w:t>
-      </w:r>
-      <w:r>
-        <w:rPr>
-          <w:i/>
-          <w:iCs/>
-        </w:rPr>
-        <w:t xml:space="preserve"> </w:t>
-      </w:r>
-      <w:r>
-        <w:rPr>
-          <w:i/>
-          <w:iCs/>
-        </w:rPr>
-        <w:t xml:space="preserve">on</w:t>
-      </w:r>
-      <w:r>
-        <w:rPr>
-          <w:i/>
-          <w:iCs/>
-        </w:rPr>
-        <w:t xml:space="preserve"> </w:t>
-      </w:r>
-      <w:r>
-        <w:rPr>
-          <w:i/>
-          <w:iCs/>
-        </w:rPr>
-        <w:t xml:space="preserve">Artificial Intelligence</w:t>
-      </w:r>
-      <w:r>
-        <w:rPr>
-          <w:i/>
-          <w:iCs/>
-        </w:rPr>
-        <w:t xml:space="preserve"> </w:t>
-      </w:r>
-      <w:r>
-        <w:rPr>
-          <w:i/>
-          <w:iCs/>
-        </w:rPr>
-        <w:t xml:space="preserve">and</w:t>
-      </w:r>
-      <w:r>
-        <w:rPr>
-          <w:i/>
-          <w:iCs/>
-        </w:rPr>
-        <w:t xml:space="preserve"> </w:t>
-      </w:r>
-      <w:r>
-        <w:rPr>
-          <w:i/>
-          <w:iCs/>
-        </w:rPr>
         <w:t xml:space="preserve">Statistics</w:t>
       </w:r>
       <w:r>
-        <w:t xml:space="preserve">, 1682–90. PMLR.</w:t>
-      </w:r>
-      <w:r>
-        <w:t xml:space="preserve"> </w:t>
-      </w:r>
-      <w:hyperlink r:id="rId78">
+        <w:t xml:space="preserve"> </w:t>
+      </w:r>
+      <w:r>
+        <w:t xml:space="preserve">[Internet]. PMLR; 2018 [cited 2026 Jan 20]. p. 1682–90. Available from:</w:t>
+      </w:r>
+      <w:r>
+        <w:t xml:space="preserve"> </w:t>
+      </w:r>
+      <w:hyperlink r:id="rId120">
         <w:r>
           <w:rPr>
             <w:rStyle w:val="Hyperlink"/>
@@ -4400,1421 +5337,294 @@
           <w:t xml:space="preserve">https://proceedings.mlr.press/v84/ge18b.html</w:t>
         </w:r>
       </w:hyperlink>
-      <w:r>
-        <w:t xml:space="preserve">.</w:t>
-      </w:r>
-    </w:p>
-    <w:bookmarkEnd w:id="79"/>
-    <w:bookmarkStart w:id="81" w:name="ref-gengJSONSchemaBenchRigorous2025"/>
+    </w:p>
+    <w:bookmarkEnd w:id="121"/>
+    <w:bookmarkStart w:id="123" w:name="Xc2db48aace4a03f6778539446eca6b2173fde89"/>
     <w:p>
       <w:pPr>
         <w:pStyle w:val="Bibliography"/>
       </w:pPr>
       <w:r>
-        <w:t xml:space="preserve">Geng, Saibo, Hudson Cooper, Michał Moskal, Samuel Jenkins, Julian Berman, Nathan Ranchin, Robert West, Eric Horvitz, and Harsha Nori. 2025.</w:t>
-      </w:r>
-      <w:r>
-        <w:t xml:space="preserve"> </w:t>
-      </w:r>
-      <w:r>
-        <w:t xml:space="preserve">“</w:t>
-      </w:r>
-      <w:r>
-        <w:t xml:space="preserve">JSONSchemaBench</w:t>
-      </w:r>
-      <w:r>
-        <w:t xml:space="preserve">:</w:t>
-      </w:r>
-      <w:r>
-        <w:t xml:space="preserve"> </w:t>
-      </w:r>
-      <w:r>
-        <w:t xml:space="preserve">A Rigorous Benchmark</w:t>
-      </w:r>
-      <w:r>
-        <w:t xml:space="preserve"> </w:t>
-      </w:r>
-      <w:r>
-        <w:t xml:space="preserve">of</w:t>
-      </w:r>
-      <w:r>
-        <w:t xml:space="preserve"> </w:t>
-      </w:r>
-      <w:r>
-        <w:t xml:space="preserve">Structured Outputs</w:t>
-      </w:r>
-      <w:r>
-        <w:t xml:space="preserve"> </w:t>
-      </w:r>
-      <w:r>
-        <w:t xml:space="preserve">for</w:t>
-      </w:r>
-      <w:r>
-        <w:t xml:space="preserve"> </w:t>
-      </w:r>
-      <w:r>
-        <w:t xml:space="preserve">Language Models</w:t>
-      </w:r>
-      <w:r>
-        <w:t xml:space="preserve">.”</w:t>
-      </w:r>
-      <w:r>
-        <w:t xml:space="preserve"> </w:t>
-      </w:r>
-      <w:r>
-        <w:rPr>
-          <w:i/>
-          <w:iCs/>
-        </w:rPr>
-        <w:t xml:space="preserve">arXiv Preprint arXiv:2501.10868</w:t>
-      </w:r>
-      <w:r>
-        <w:t xml:space="preserve">, February.</w:t>
-      </w:r>
-      <w:r>
-        <w:t xml:space="preserve"> </w:t>
-      </w:r>
-      <w:hyperlink r:id="rId80">
+        <w:t xml:space="preserve">26.</w:t>
+      </w:r>
+      <w:r>
+        <w:t xml:space="preserve"> </w:t>
+      </w:r>
+      <w:r>
+        <w:t xml:space="preserve">	</w:t>
+      </w:r>
+      <w:r>
+        <w:t xml:space="preserve">Zhang S, Wang H, Cho Y, Wong W, Yarchoan M, Jaffee EM, et al. Quantitative</w:t>
+      </w:r>
+      <w:r>
+        <w:t xml:space="preserve"> </w:t>
+      </w:r>
+      <w:r>
+        <w:t xml:space="preserve">Calibration</w:t>
+      </w:r>
+      <w:r>
+        <w:t xml:space="preserve"> </w:t>
+      </w:r>
+      <w:r>
+        <w:t xml:space="preserve">of a</w:t>
+      </w:r>
+      <w:r>
+        <w:t xml:space="preserve"> </w:t>
+      </w:r>
+      <w:r>
+        <w:t xml:space="preserve">Spatial QSP Model Identifies Fibroblast Impact</w:t>
+      </w:r>
+      <w:r>
+        <w:t xml:space="preserve"> </w:t>
+      </w:r>
+      <w:r>
+        <w:t xml:space="preserve">on</w:t>
+      </w:r>
+      <w:r>
+        <w:t xml:space="preserve"> </w:t>
+      </w:r>
+      <w:r>
+        <w:t xml:space="preserve">HCC Immunotherapy</w:t>
+      </w:r>
+      <w:r>
+        <w:t xml:space="preserve">. bioRxiv. 2025 Nov;2025.10.31.685939. doi:</w:t>
+      </w:r>
+      <w:hyperlink r:id="rId122">
         <w:r>
           <w:rPr>
             <w:rStyle w:val="Hyperlink"/>
           </w:rPr>
-          <w:t xml:space="preserve">https://doi.org/10.48550/arXiv.2501.10868</w:t>
+          <w:t xml:space="preserve">10.1101/2025.10.31.685939</w:t>
         </w:r>
       </w:hyperlink>
-      <w:r>
-        <w:t xml:space="preserve">.</w:t>
-      </w:r>
-    </w:p>
-    <w:bookmarkEnd w:id="81"/>
-    <w:bookmarkStart w:id="83" w:name="X2f6b6eadf1efbef9100880a05728250484d836f"/>
+    </w:p>
+    <w:bookmarkEnd w:id="123"/>
+    <w:bookmarkStart w:id="126" w:name="ref-liMitigatingHallucinationLarge2025"/>
     <w:p>
       <w:pPr>
         <w:pStyle w:val="Bibliography"/>
       </w:pPr>
       <w:r>
-        <w:t xml:space="preserve">Gonzalez Hernandez, Ferran, Quang Nguyen, Victoria C. Smith, José Antonio Cordero, Maria Rosa Ballester, Màrius Duran, Albert Solé, et al. 2024.</w:t>
-      </w:r>
-      <w:r>
-        <w:t xml:space="preserve"> </w:t>
-      </w:r>
-      <w:r>
-        <w:t xml:space="preserve">“Named Entity Recognition of Pharmacokinetic Parameters in the Scientific Literature.”</w:t>
-      </w:r>
-      <w:r>
-        <w:t xml:space="preserve"> </w:t>
-      </w:r>
-      <w:r>
-        <w:rPr>
-          <w:i/>
-          <w:iCs/>
-        </w:rPr>
-        <w:t xml:space="preserve">Scientific Reports</w:t>
-      </w:r>
-      <w:r>
-        <w:t xml:space="preserve"> </w:t>
-      </w:r>
-      <w:r>
-        <w:t xml:space="preserve">14 (1): 23485.</w:t>
-      </w:r>
-      <w:r>
-        <w:t xml:space="preserve"> </w:t>
-      </w:r>
-      <w:hyperlink r:id="rId82">
+        <w:t xml:space="preserve">27.</w:t>
+      </w:r>
+      <w:r>
+        <w:t xml:space="preserve"> </w:t>
+      </w:r>
+      <w:r>
+        <w:t xml:space="preserve">	</w:t>
+      </w:r>
+      <w:r>
+        <w:t xml:space="preserve">Li Y, Fu X, Verma G, Buitelaar P, Liu M. Mitigating</w:t>
+      </w:r>
+      <w:r>
+        <w:t xml:space="preserve"> </w:t>
+      </w:r>
+      <w:r>
+        <w:t xml:space="preserve">Hallucination</w:t>
+      </w:r>
+      <w:r>
+        <w:t xml:space="preserve"> </w:t>
+      </w:r>
+      <w:r>
+        <w:t xml:space="preserve">in</w:t>
+      </w:r>
+      <w:r>
+        <w:t xml:space="preserve"> </w:t>
+      </w:r>
+      <w:r>
+        <w:t xml:space="preserve">Large Language Models</w:t>
+      </w:r>
+      <w:r>
+        <w:t xml:space="preserve"> </w:t>
+      </w:r>
+      <w:r>
+        <w:t xml:space="preserve">(</w:t>
+      </w:r>
+      <w:r>
+        <w:t xml:space="preserve">LLMs</w:t>
+      </w:r>
+      <w:r>
+        <w:t xml:space="preserve">):</w:t>
+      </w:r>
+      <w:r>
+        <w:t xml:space="preserve"> </w:t>
+      </w:r>
+      <w:r>
+        <w:t xml:space="preserve">An Application-Oriented Survey</w:t>
+      </w:r>
+      <w:r>
+        <w:t xml:space="preserve"> </w:t>
+      </w:r>
+      <w:r>
+        <w:t xml:space="preserve">on</w:t>
+      </w:r>
+      <w:r>
+        <w:t xml:space="preserve"> </w:t>
+      </w:r>
+      <w:r>
+        <w:t xml:space="preserve">RAG</w:t>
+      </w:r>
+      <w:r>
+        <w:t xml:space="preserve">,</w:t>
+      </w:r>
+      <w:r>
+        <w:t xml:space="preserve"> </w:t>
+      </w:r>
+      <w:r>
+        <w:t xml:space="preserve">Reasoning</w:t>
+      </w:r>
+      <w:r>
+        <w:t xml:space="preserve">, and</w:t>
+      </w:r>
+      <w:r>
+        <w:t xml:space="preserve"> </w:t>
+      </w:r>
+      <w:r>
+        <w:t xml:space="preserve">Agentic Systems</w:t>
+      </w:r>
+      <w:r>
+        <w:t xml:space="preserve"> </w:t>
+      </w:r>
+      <w:r>
+        <w:t xml:space="preserve">[Internet]. arXiv; 2025 [cited 2026 Feb 5]. Available from:</w:t>
+      </w:r>
+      <w:r>
+        <w:t xml:space="preserve"> </w:t>
+      </w:r>
+      <w:hyperlink r:id="rId124">
         <w:r>
           <w:rPr>
             <w:rStyle w:val="Hyperlink"/>
           </w:rPr>
-          <w:t xml:space="preserve">https://doi.org/10.1038/s41598-024-73338-3</w:t>
+          <w:t xml:space="preserve">https://arxiv.org/abs/2510.24476</w:t>
         </w:r>
       </w:hyperlink>
       <w:r>
-        <w:t xml:space="preserve">.</w:t>
-      </w:r>
-    </w:p>
-    <w:bookmarkEnd w:id="83"/>
-    <w:bookmarkStart w:id="85" w:name="X723aaa622dba1924fafa92c7b97217b2f286bab"/>
-    <w:p>
-      <w:pPr>
-        <w:pStyle w:val="Bibliography"/>
-      </w:pPr>
-      <w:r>
-        <w:t xml:space="preserve">Goryanin, Igor, Irina Goryanin, and Oleg Demin. 2025.</w:t>
-      </w:r>
-      <w:r>
-        <w:t xml:space="preserve"> </w:t>
-      </w:r>
-      <w:r>
-        <w:t xml:space="preserve">“Revolutionizing Drug Discovery:</w:t>
-      </w:r>
-      <w:r>
-        <w:t xml:space="preserve"> </w:t>
-      </w:r>
-      <w:r>
-        <w:t xml:space="preserve">Integrating</w:t>
-      </w:r>
-      <w:r>
-        <w:t xml:space="preserve"> </w:t>
-      </w:r>
-      <w:r>
-        <w:t xml:space="preserve">Artificial Intelligence with Quantitative Systems Pharmacology.”</w:t>
-      </w:r>
-      <w:r>
-        <w:t xml:space="preserve"> </w:t>
-      </w:r>
-      <w:r>
-        <w:rPr>
-          <w:i/>
-          <w:iCs/>
-        </w:rPr>
-        <w:t xml:space="preserve">Drug Discovery Today</w:t>
-      </w:r>
-      <w:r>
-        <w:t xml:space="preserve"> </w:t>
-      </w:r>
-      <w:r>
-        <w:t xml:space="preserve">30 (9): 104448.</w:t>
-      </w:r>
-      <w:r>
-        <w:t xml:space="preserve"> </w:t>
-      </w:r>
-      <w:hyperlink r:id="rId84">
+        <w:t xml:space="preserve"> </w:t>
+      </w:r>
+      <w:r>
+        <w:t xml:space="preserve">doi:</w:t>
+      </w:r>
+      <w:hyperlink r:id="rId125">
         <w:r>
           <w:rPr>
             <w:rStyle w:val="Hyperlink"/>
           </w:rPr>
-          <w:t xml:space="preserve">https://doi.org/10.1016/j.drudis.2025.104448</w:t>
+          <w:t xml:space="preserve">10.48550/arXiv.2510.24476</w:t>
         </w:r>
       </w:hyperlink>
-      <w:r>
-        <w:t xml:space="preserve">.</w:t>
-      </w:r>
-    </w:p>
-    <w:bookmarkEnd w:id="85"/>
-    <w:bookmarkStart w:id="87" w:name="ref-Grecco_Pint_2025"/>
+    </w:p>
+    <w:bookmarkEnd w:id="126"/>
+    <w:bookmarkStart w:id="128" w:name="ref-gengJSONSchemaBenchRigorous2025"/>
     <w:p>
       <w:pPr>
         <w:pStyle w:val="Bibliography"/>
       </w:pPr>
       <w:r>
-        <w:t xml:space="preserve">Grecco, Hernán E. 2025.</w:t>
-      </w:r>
-      <w:r>
-        <w:t xml:space="preserve"> </w:t>
-      </w:r>
-      <w:r>
-        <w:t xml:space="preserve">“</w:t>
-      </w:r>
-      <w:r>
-        <w:t xml:space="preserve">Pint: Operate and manipulate physical quantities in Python</w:t>
-      </w:r>
-      <w:r>
-        <w:t xml:space="preserve">.”</w:t>
-      </w:r>
-      <w:r>
-        <w:t xml:space="preserve"> </w:t>
-      </w:r>
-      <w:hyperlink r:id="rId86">
+        <w:t xml:space="preserve">28.</w:t>
+      </w:r>
+      <w:r>
+        <w:t xml:space="preserve"> </w:t>
+      </w:r>
+      <w:r>
+        <w:t xml:space="preserve">	</w:t>
+      </w:r>
+      <w:r>
+        <w:t xml:space="preserve">Geng S, Cooper H, Moskal M, Jenkins S, Berman J, Ranchin N, et al.</w:t>
+      </w:r>
+      <w:r>
+        <w:t xml:space="preserve"> </w:t>
+      </w:r>
+      <w:r>
+        <w:t xml:space="preserve">JSONSchemaBench</w:t>
+      </w:r>
+      <w:r>
+        <w:t xml:space="preserve">:</w:t>
+      </w:r>
+      <w:r>
+        <w:t xml:space="preserve"> </w:t>
+      </w:r>
+      <w:r>
+        <w:t xml:space="preserve">A Rigorous Benchmark</w:t>
+      </w:r>
+      <w:r>
+        <w:t xml:space="preserve"> </w:t>
+      </w:r>
+      <w:r>
+        <w:t xml:space="preserve">of</w:t>
+      </w:r>
+      <w:r>
+        <w:t xml:space="preserve"> </w:t>
+      </w:r>
+      <w:r>
+        <w:t xml:space="preserve">Structured Outputs</w:t>
+      </w:r>
+      <w:r>
+        <w:t xml:space="preserve"> </w:t>
+      </w:r>
+      <w:r>
+        <w:t xml:space="preserve">for</w:t>
+      </w:r>
+      <w:r>
+        <w:t xml:space="preserve"> </w:t>
+      </w:r>
+      <w:r>
+        <w:t xml:space="preserve">Language Models</w:t>
+      </w:r>
+      <w:r>
+        <w:t xml:space="preserve">. arXiv preprint arXiv:250110868. 2025 Feb. doi:</w:t>
+      </w:r>
+      <w:hyperlink r:id="rId127">
         <w:r>
           <w:rPr>
             <w:rStyle w:val="Hyperlink"/>
           </w:rPr>
-          <w:t xml:space="preserve">https://github.com/hgrecco/pint</w:t>
+          <w:t xml:space="preserve">10.48550/arXiv.2501.10868</w:t>
         </w:r>
       </w:hyperlink>
-      <w:r>
-        <w:t xml:space="preserve">.</w:t>
-      </w:r>
-    </w:p>
-    <w:bookmarkEnd w:id="87"/>
-    <w:bookmarkStart w:id="89" w:name="ref-heAIpoweredImmuneCell2026"/>
+    </w:p>
+    <w:bookmarkEnd w:id="128"/>
+    <w:bookmarkStart w:id="130" w:name="ref-gaoJointExtractionEntity2024"/>
     <w:p>
       <w:pPr>
         <w:pStyle w:val="Bibliography"/>
       </w:pPr>
       <w:r>
-        <w:t xml:space="preserve">He, Shan, Yukun Tan, Qing Ye, Matthew M Gubin, Merve Dede, Hind Rafei, Weiyi Peng, Katayoun Rezvani, Vakul Mohanty, and Ken Chen. 2026.</w:t>
-      </w:r>
-      <w:r>
-        <w:t xml:space="preserve"> </w:t>
-      </w:r>
-      <w:r>
-        <w:t xml:space="preserve">“</w:t>
-      </w:r>
-      <w:r>
-        <w:t xml:space="preserve">AI-powered Immune Cell Knowledge Graph</w:t>
-      </w:r>
-      <w:r>
-        <w:t xml:space="preserve"> </w:t>
-      </w:r>
-      <w:r>
-        <w:t xml:space="preserve">(</w:t>
-      </w:r>
-      <w:r>
-        <w:t xml:space="preserve">ICKG</w:t>
-      </w:r>
-      <w:r>
-        <w:t xml:space="preserve">) with Granular Immune Contexts Enables Immune Program Interpretation.”</w:t>
-      </w:r>
-      <w:r>
-        <w:t xml:space="preserve"> </w:t>
-      </w:r>
-      <w:r>
-        <w:rPr>
-          <w:i/>
-          <w:iCs/>
-        </w:rPr>
-        <w:t xml:space="preserve">Npj Artificial Intelligence</w:t>
-      </w:r>
-      <w:r>
-        <w:t xml:space="preserve"> </w:t>
-      </w:r>
-      <w:r>
-        <w:t xml:space="preserve">2 (1): 13.</w:t>
-      </w:r>
-      <w:r>
-        <w:t xml:space="preserve"> </w:t>
-      </w:r>
-      <w:hyperlink r:id="rId88">
+        <w:t xml:space="preserve">29.</w:t>
+      </w:r>
+      <w:r>
+        <w:t xml:space="preserve"> </w:t>
+      </w:r>
+      <w:r>
+        <w:t xml:space="preserve">	</w:t>
+      </w:r>
+      <w:r>
+        <w:t xml:space="preserve">Gao T, Zhai X, Yang C, Lv L, Wang H. Joint extraction of entity and relation based on fine-tuning</w:t>
+      </w:r>
+      <w:r>
+        <w:t xml:space="preserve"> </w:t>
+      </w:r>
+      <w:r>
+        <w:t xml:space="preserve">BERT</w:t>
+      </w:r>
+      <w:r>
+        <w:t xml:space="preserve"> </w:t>
+      </w:r>
+      <w:r>
+        <w:t xml:space="preserve">for long biomedical literatures. Bioinformatics Advances. 2024 Jan;4(1):vbae194. doi:</w:t>
+      </w:r>
+      <w:hyperlink r:id="rId129">
         <w:r>
           <w:rPr>
             <w:rStyle w:val="Hyperlink"/>
           </w:rPr>
-          <w:t xml:space="preserve">https://doi.org/10.1038/s44387-025-00060-4</w:t>
+          <w:t xml:space="preserve">10.1093/bioadv/vbae194</w:t>
         </w:r>
       </w:hyperlink>
-      <w:r>
-        <w:t xml:space="preserve">.</w:t>
-      </w:r>
-    </w:p>
-    <w:bookmarkEnd w:id="89"/>
-    <w:bookmarkStart w:id="91" w:name="ref-hsuLLMIEPythonPackage2025"/>
-    <w:p>
-      <w:pPr>
-        <w:pStyle w:val="Bibliography"/>
-      </w:pPr>
-      <w:r>
-        <w:t xml:space="preserve">Hsu, Enshuo, and Kirk Roberts. 2025.</w:t>
-      </w:r>
-      <w:r>
-        <w:t xml:space="preserve"> </w:t>
-      </w:r>
-      <w:r>
-        <w:t xml:space="preserve">“</w:t>
-      </w:r>
-      <w:r>
-        <w:t xml:space="preserve">LLM-IE</w:t>
-      </w:r>
-      <w:r>
-        <w:t xml:space="preserve">: A Python Package for Biomedical Generative Information Extraction with Large Language Models.”</w:t>
-      </w:r>
-      <w:r>
-        <w:t xml:space="preserve"> </w:t>
-      </w:r>
-      <w:r>
-        <w:rPr>
-          <w:i/>
-          <w:iCs/>
-        </w:rPr>
-        <w:t xml:space="preserve">JAMIA Open</w:t>
-      </w:r>
-      <w:r>
-        <w:t xml:space="preserve"> </w:t>
-      </w:r>
-      <w:r>
-        <w:t xml:space="preserve">8 (2): ooaf012.</w:t>
-      </w:r>
-      <w:r>
-        <w:t xml:space="preserve"> </w:t>
-      </w:r>
-      <w:hyperlink r:id="rId90">
-        <w:r>
-          <w:rPr>
-            <w:rStyle w:val="Hyperlink"/>
-          </w:rPr>
-          <w:t xml:space="preserve">https://doi.org/10.1093/jamiaopen/ooaf012</w:t>
-        </w:r>
-      </w:hyperlink>
-      <w:r>
-        <w:t xml:space="preserve">.</w:t>
-      </w:r>
-    </w:p>
-    <w:bookmarkEnd w:id="91"/>
-    <w:bookmarkStart w:id="93" w:name="ref-huAccurateMedicalNamed2024"/>
-    <w:p>
-      <w:pPr>
-        <w:pStyle w:val="Bibliography"/>
-      </w:pPr>
-      <w:r>
-        <w:t xml:space="preserve">Hu, Jiacheng, Runyuan Bao, Yang Lin, Hanchao Zhang, and Yanlin Xiang. 2024.</w:t>
-      </w:r>
-      <w:r>
-        <w:t xml:space="preserve"> </w:t>
-      </w:r>
-      <w:r>
-        <w:t xml:space="preserve">“Accurate</w:t>
-      </w:r>
-      <w:r>
-        <w:t xml:space="preserve"> </w:t>
-      </w:r>
-      <w:r>
-        <w:t xml:space="preserve">Medical Named Entity Recognition Through Specialized NLP Models</w:t>
-      </w:r>
-      <w:r>
-        <w:t xml:space="preserve">.”</w:t>
-      </w:r>
-      <w:r>
-        <w:t xml:space="preserve"> </w:t>
-      </w:r>
-      <w:r>
-        <w:rPr>
-          <w:i/>
-          <w:iCs/>
-        </w:rPr>
-        <w:t xml:space="preserve">arXiv Preprint arXiv:2412.08255</w:t>
-      </w:r>
-      <w:r>
-        <w:t xml:space="preserve">, December.</w:t>
-      </w:r>
-      <w:r>
-        <w:t xml:space="preserve"> </w:t>
-      </w:r>
-      <w:hyperlink r:id="rId92">
-        <w:r>
-          <w:rPr>
-            <w:rStyle w:val="Hyperlink"/>
-          </w:rPr>
-          <w:t xml:space="preserve">https://doi.org/10.48550/arXiv.2412.08255</w:t>
-        </w:r>
-      </w:hyperlink>
-      <w:r>
-        <w:t xml:space="preserve">.</w:t>
-      </w:r>
-    </w:p>
-    <w:bookmarkEnd w:id="93"/>
-    <w:bookmarkStart w:id="95" w:name="ref-huangSurveyHallucinationLarge2025"/>
-    <w:p>
-      <w:pPr>
-        <w:pStyle w:val="Bibliography"/>
-      </w:pPr>
-      <w:r>
-        <w:t xml:space="preserve">Huang, Lei, Weijiang Yu, Weitao Ma, Weihong Zhong, Zhangyin Feng, Haotian Wang, Qianglong Chen, et al. 2025.</w:t>
-      </w:r>
-      <w:r>
-        <w:t xml:space="preserve"> </w:t>
-      </w:r>
-      <w:r>
-        <w:t xml:space="preserve">“A</w:t>
-      </w:r>
-      <w:r>
-        <w:t xml:space="preserve"> </w:t>
-      </w:r>
-      <w:r>
-        <w:t xml:space="preserve">Survey</w:t>
-      </w:r>
-      <w:r>
-        <w:t xml:space="preserve"> </w:t>
-      </w:r>
-      <w:r>
-        <w:t xml:space="preserve">on</w:t>
-      </w:r>
-      <w:r>
-        <w:t xml:space="preserve"> </w:t>
-      </w:r>
-      <w:r>
-        <w:t xml:space="preserve">Hallucination</w:t>
-      </w:r>
-      <w:r>
-        <w:t xml:space="preserve"> </w:t>
-      </w:r>
-      <w:r>
-        <w:t xml:space="preserve">in</w:t>
-      </w:r>
-      <w:r>
-        <w:t xml:space="preserve"> </w:t>
-      </w:r>
-      <w:r>
-        <w:t xml:space="preserve">Large Language Models</w:t>
-      </w:r>
-      <w:r>
-        <w:t xml:space="preserve">:</w:t>
-      </w:r>
-      <w:r>
-        <w:t xml:space="preserve"> </w:t>
-      </w:r>
-      <w:r>
-        <w:t xml:space="preserve">Principles</w:t>
-      </w:r>
-      <w:r>
-        <w:t xml:space="preserve">,</w:t>
-      </w:r>
-      <w:r>
-        <w:t xml:space="preserve"> </w:t>
-      </w:r>
-      <w:r>
-        <w:t xml:space="preserve">Taxonomy</w:t>
-      </w:r>
-      <w:r>
-        <w:t xml:space="preserve">,</w:t>
-      </w:r>
-      <w:r>
-        <w:t xml:space="preserve"> </w:t>
-      </w:r>
-      <w:r>
-        <w:t xml:space="preserve">Challenges</w:t>
-      </w:r>
-      <w:r>
-        <w:t xml:space="preserve">, and</w:t>
-      </w:r>
-      <w:r>
-        <w:t xml:space="preserve"> </w:t>
-      </w:r>
-      <w:r>
-        <w:t xml:space="preserve">Open Questions</w:t>
-      </w:r>
-      <w:r>
-        <w:t xml:space="preserve">.”</w:t>
-      </w:r>
-      <w:r>
-        <w:t xml:space="preserve"> </w:t>
-      </w:r>
-      <w:r>
-        <w:rPr>
-          <w:i/>
-          <w:iCs/>
-        </w:rPr>
-        <w:t xml:space="preserve">ACM Transactions on Information Systems</w:t>
-      </w:r>
-      <w:r>
-        <w:t xml:space="preserve"> </w:t>
-      </w:r>
-      <w:r>
-        <w:t xml:space="preserve">43 (2): 1–55.</w:t>
-      </w:r>
-      <w:r>
-        <w:t xml:space="preserve"> </w:t>
-      </w:r>
-      <w:hyperlink r:id="rId94">
-        <w:r>
-          <w:rPr>
-            <w:rStyle w:val="Hyperlink"/>
-          </w:rPr>
-          <w:t xml:space="preserve">https://doi.org/10.1145/3703155</w:t>
-        </w:r>
-      </w:hyperlink>
-      <w:r>
-        <w:t xml:space="preserve">.</w:t>
-      </w:r>
-    </w:p>
-    <w:bookmarkEnd w:id="95"/>
-    <w:bookmarkStart w:id="97" w:name="ref-khanCollaborativeLargeLanguage2024"/>
-    <w:p>
-      <w:pPr>
-        <w:pStyle w:val="Bibliography"/>
-      </w:pPr>
-      <w:r>
-        <w:t xml:space="preserve">Khan, Muhammad Ali, Umair Ayub, Syed Arsalan Ahmed Naqvi, Kaneez Zahra Rubab Khakwani, Zaryab Bin Riaz Sipra, Ammad Raina, Sihan Zou, et al. 2024.</w:t>
-      </w:r>
-      <w:r>
-        <w:t xml:space="preserve"> </w:t>
-      </w:r>
-      <w:r>
-        <w:t xml:space="preserve">“Collaborative</w:t>
-      </w:r>
-      <w:r>
-        <w:t xml:space="preserve"> </w:t>
-      </w:r>
-      <w:r>
-        <w:t xml:space="preserve">Large Language Models</w:t>
-      </w:r>
-      <w:r>
-        <w:t xml:space="preserve"> </w:t>
-      </w:r>
-      <w:r>
-        <w:t xml:space="preserve">for</w:t>
-      </w:r>
-      <w:r>
-        <w:t xml:space="preserve"> </w:t>
-      </w:r>
-      <w:r>
-        <w:t xml:space="preserve">Automated Data Extraction</w:t>
-      </w:r>
-      <w:r>
-        <w:t xml:space="preserve"> </w:t>
-      </w:r>
-      <w:r>
-        <w:t xml:space="preserve">in</w:t>
-      </w:r>
-      <w:r>
-        <w:t xml:space="preserve"> </w:t>
-      </w:r>
-      <w:r>
-        <w:t xml:space="preserve">Living Systematic Reviews</w:t>
-      </w:r>
-      <w:r>
-        <w:t xml:space="preserve">.”</w:t>
-      </w:r>
-      <w:r>
-        <w:t xml:space="preserve"> </w:t>
-      </w:r>
-      <w:r>
-        <w:rPr>
-          <w:i/>
-          <w:iCs/>
-        </w:rPr>
-        <w:t xml:space="preserve">medRxiv: The Preprint Server for Health Sciences</w:t>
-      </w:r>
-      <w:r>
-        <w:t xml:space="preserve">, September, 2024.09.20.24314108.</w:t>
-      </w:r>
-      <w:r>
-        <w:t xml:space="preserve"> </w:t>
-      </w:r>
-      <w:hyperlink r:id="rId96">
-        <w:r>
-          <w:rPr>
-            <w:rStyle w:val="Hyperlink"/>
-          </w:rPr>
-          <w:t xml:space="preserve">https://doi.org/10.1101/2024.09.20.24314108</w:t>
-        </w:r>
-      </w:hyperlink>
-      <w:r>
-        <w:t xml:space="preserve">.</w:t>
-      </w:r>
-    </w:p>
-    <w:bookmarkEnd w:id="97"/>
-    <w:bookmarkStart w:id="99" w:name="ref-liMitigatingHallucinationLarge2025"/>
-    <w:p>
-      <w:pPr>
-        <w:pStyle w:val="Bibliography"/>
-      </w:pPr>
-      <w:r>
-        <w:t xml:space="preserve">Li, Yihan, Xiyuan Fu, Ghanshyam Verma, Paul Buitelaar, and Mingming Liu. 2025.</w:t>
-      </w:r>
-      <w:r>
-        <w:t xml:space="preserve"> </w:t>
-      </w:r>
-      <w:r>
-        <w:t xml:space="preserve">“Mitigating</w:t>
-      </w:r>
-      <w:r>
-        <w:t xml:space="preserve"> </w:t>
-      </w:r>
-      <w:r>
-        <w:t xml:space="preserve">Hallucination</w:t>
-      </w:r>
-      <w:r>
-        <w:t xml:space="preserve"> </w:t>
-      </w:r>
-      <w:r>
-        <w:t xml:space="preserve">in</w:t>
-      </w:r>
-      <w:r>
-        <w:t xml:space="preserve"> </w:t>
-      </w:r>
-      <w:r>
-        <w:t xml:space="preserve">Large Language Models</w:t>
-      </w:r>
-      <w:r>
-        <w:t xml:space="preserve"> </w:t>
-      </w:r>
-      <w:r>
-        <w:t xml:space="preserve">(</w:t>
-      </w:r>
-      <w:r>
-        <w:t xml:space="preserve">LLMs</w:t>
-      </w:r>
-      <w:r>
-        <w:t xml:space="preserve">):</w:t>
-      </w:r>
-      <w:r>
-        <w:t xml:space="preserve"> </w:t>
-      </w:r>
-      <w:r>
-        <w:t xml:space="preserve">An Application-Oriented Survey</w:t>
-      </w:r>
-      <w:r>
-        <w:t xml:space="preserve"> </w:t>
-      </w:r>
-      <w:r>
-        <w:t xml:space="preserve">on</w:t>
-      </w:r>
-      <w:r>
-        <w:t xml:space="preserve"> </w:t>
-      </w:r>
-      <w:r>
-        <w:t xml:space="preserve">RAG</w:t>
-      </w:r>
-      <w:r>
-        <w:t xml:space="preserve">,</w:t>
-      </w:r>
-      <w:r>
-        <w:t xml:space="preserve"> </w:t>
-      </w:r>
-      <w:r>
-        <w:t xml:space="preserve">Reasoning</w:t>
-      </w:r>
-      <w:r>
-        <w:t xml:space="preserve">, and</w:t>
-      </w:r>
-      <w:r>
-        <w:t xml:space="preserve"> </w:t>
-      </w:r>
-      <w:r>
-        <w:t xml:space="preserve">Agentic Systems</w:t>
-      </w:r>
-      <w:r>
-        <w:t xml:space="preserve">.”</w:t>
-      </w:r>
-      <w:r>
-        <w:t xml:space="preserve"> </w:t>
-      </w:r>
-      <w:r>
-        <w:t xml:space="preserve">arXiv.</w:t>
-      </w:r>
-      <w:r>
-        <w:t xml:space="preserve"> </w:t>
-      </w:r>
-      <w:hyperlink r:id="rId98">
-        <w:r>
-          <w:rPr>
-            <w:rStyle w:val="Hyperlink"/>
-          </w:rPr>
-          <w:t xml:space="preserve">https://doi.org/10.48550/arXiv.2510.24476</w:t>
-        </w:r>
-      </w:hyperlink>
-      <w:r>
-        <w:t xml:space="preserve">.</w:t>
-      </w:r>
-    </w:p>
-    <w:bookmarkEnd w:id="99"/>
-    <w:bookmarkStart w:id="101" w:name="Xa1423de0e5574a091a8a2397c71c4dc91c30f4b"/>
-    <w:p>
-      <w:pPr>
-        <w:pStyle w:val="Bibliography"/>
-      </w:pPr>
-      <w:r>
-        <w:t xml:space="preserve">Pandit, Shrey, Jiawei Xu, Junyuan Hong, Zhangyang Wang, Tianlong Chen, Kaidi Xu, and Ying Ding. 2025.</w:t>
-      </w:r>
-      <w:r>
-        <w:t xml:space="preserve"> </w:t>
-      </w:r>
-      <w:r>
-        <w:t xml:space="preserve">“</w:t>
-      </w:r>
-      <w:r>
-        <w:t xml:space="preserve">MedHallu</w:t>
-      </w:r>
-      <w:r>
-        <w:t xml:space="preserve">:</w:t>
-      </w:r>
-      <w:r>
-        <w:t xml:space="preserve"> </w:t>
-      </w:r>
-      <w:r>
-        <w:t xml:space="preserve">A Comprehensive Benchmark</w:t>
-      </w:r>
-      <w:r>
-        <w:t xml:space="preserve"> </w:t>
-      </w:r>
-      <w:r>
-        <w:t xml:space="preserve">for</w:t>
-      </w:r>
-      <w:r>
-        <w:t xml:space="preserve"> </w:t>
-      </w:r>
-      <w:r>
-        <w:t xml:space="preserve">Detecting Medical Hallucinations</w:t>
-      </w:r>
-      <w:r>
-        <w:t xml:space="preserve"> </w:t>
-      </w:r>
-      <w:r>
-        <w:t xml:space="preserve">in</w:t>
-      </w:r>
-      <w:r>
-        <w:t xml:space="preserve"> </w:t>
-      </w:r>
-      <w:r>
-        <w:t xml:space="preserve">Large Language Models</w:t>
-      </w:r>
-      <w:r>
-        <w:t xml:space="preserve">.”</w:t>
-      </w:r>
-      <w:r>
-        <w:t xml:space="preserve"> </w:t>
-      </w:r>
-      <w:r>
-        <w:t xml:space="preserve">arXiv.</w:t>
-      </w:r>
-      <w:r>
-        <w:t xml:space="preserve"> </w:t>
-      </w:r>
-      <w:hyperlink r:id="rId100">
-        <w:r>
-          <w:rPr>
-            <w:rStyle w:val="Hyperlink"/>
-          </w:rPr>
-          <w:t xml:space="preserve">https://doi.org/10.48550/arXiv.2502.14302</w:t>
-        </w:r>
-      </w:hyperlink>
-      <w:r>
-        <w:t xml:space="preserve">.</w:t>
-      </w:r>
-    </w:p>
-    <w:bookmarkEnd w:id="101"/>
-    <w:bookmarkStart w:id="103" w:name="ref-Pydantic_Logfire_2025"/>
-    <w:p>
-      <w:pPr>
-        <w:pStyle w:val="Bibliography"/>
-      </w:pPr>
-      <w:r>
-        <w:t xml:space="preserve">Pydantic. 2025.</w:t>
-      </w:r>
-      <w:r>
-        <w:t xml:space="preserve"> </w:t>
-      </w:r>
-      <w:r>
-        <w:t xml:space="preserve">“</w:t>
-      </w:r>
-      <w:r>
-        <w:t xml:space="preserve">Logfire: Observability platform for Python applications</w:t>
-      </w:r>
-      <w:r>
-        <w:t xml:space="preserve">.”</w:t>
-      </w:r>
-      <w:r>
-        <w:t xml:space="preserve"> </w:t>
-      </w:r>
-      <w:hyperlink r:id="rId102">
-        <w:r>
-          <w:rPr>
-            <w:rStyle w:val="Hyperlink"/>
-          </w:rPr>
-          <w:t xml:space="preserve">https://pydantic.dev/logfire</w:t>
-        </w:r>
-      </w:hyperlink>
-      <w:r>
-        <w:t xml:space="preserve">.</w:t>
-      </w:r>
-    </w:p>
-    <w:bookmarkEnd w:id="103"/>
-    <w:bookmarkStart w:id="105" w:name="X39e1811d99360c3b2419412e4379c4441c3ec60"/>
-    <w:p>
-      <w:pPr>
-        <w:pStyle w:val="Bibliography"/>
-      </w:pPr>
-      <w:r>
-        <w:t xml:space="preserve">Rieger, Theodore R., Richard J. Allen, Lukas Bystricky, Yuzhou Chen, Glen Wright Colopy, Yifan Cui, Angelica Gonzalez, et al. 2018.</w:t>
-      </w:r>
-      <w:r>
-        <w:t xml:space="preserve"> </w:t>
-      </w:r>
-      <w:r>
-        <w:t xml:space="preserve">“Improving the Generation and Selection of Virtual Populations in Quantitative Systems Pharmacology Models.”</w:t>
-      </w:r>
-      <w:r>
-        <w:t xml:space="preserve"> </w:t>
-      </w:r>
-      <w:r>
-        <w:rPr>
-          <w:i/>
-          <w:iCs/>
-        </w:rPr>
-        <w:t xml:space="preserve">Progress in Biophysics and Molecular Biology</w:t>
-      </w:r>
-      <w:r>
-        <w:t xml:space="preserve">, Quantitative</w:t>
-      </w:r>
-      <w:r>
-        <w:t xml:space="preserve"> </w:t>
-      </w:r>
-      <w:r>
-        <w:t xml:space="preserve">Systems Pharmacology</w:t>
-      </w:r>
-      <w:r>
-        <w:t xml:space="preserve"> </w:t>
-      </w:r>
-      <w:r>
-        <w:t xml:space="preserve">(</w:t>
-      </w:r>
-      <w:r>
-        <w:t xml:space="preserve">QSP</w:t>
-      </w:r>
-      <w:r>
-        <w:t xml:space="preserve">):</w:t>
-      </w:r>
-      <w:r>
-        <w:t xml:space="preserve"> </w:t>
-      </w:r>
-      <w:r>
-        <w:t xml:space="preserve">Methods</w:t>
-      </w:r>
-      <w:r>
-        <w:t xml:space="preserve"> </w:t>
-      </w:r>
-      <w:r>
-        <w:t xml:space="preserve">and</w:t>
-      </w:r>
-      <w:r>
-        <w:t xml:space="preserve"> </w:t>
-      </w:r>
-      <w:r>
-        <w:t xml:space="preserve">Tools</w:t>
-      </w:r>
-      <w:r>
-        <w:t xml:space="preserve">, 139 (November): 15–22.</w:t>
-      </w:r>
-      <w:r>
-        <w:t xml:space="preserve"> </w:t>
-      </w:r>
-      <w:hyperlink r:id="rId104">
-        <w:r>
-          <w:rPr>
-            <w:rStyle w:val="Hyperlink"/>
-          </w:rPr>
-          <w:t xml:space="preserve">https://doi.org/10.1016/j.pbiomolbio.2018.06.002</w:t>
-        </w:r>
-      </w:hyperlink>
-      <w:r>
-        <w:t xml:space="preserve">.</w:t>
-      </w:r>
-    </w:p>
-    <w:bookmarkEnd w:id="105"/>
-    <w:bookmarkStart w:id="107" w:name="X1029472ca037a74b06f54723d7b391db09d7c53"/>
-    <w:p>
-      <w:pPr>
-        <w:pStyle w:val="Bibliography"/>
-      </w:pPr>
-      <w:r>
-        <w:t xml:space="preserve">Saini, Anuraag, and Ali Farnoud. 2025.</w:t>
-      </w:r>
-      <w:r>
-        <w:t xml:space="preserve"> </w:t>
-      </w:r>
-      <w:r>
-        <w:t xml:space="preserve">“</w:t>
-      </w:r>
-      <w:r>
-        <w:t xml:space="preserve">QSP-Copilot</w:t>
-      </w:r>
-      <w:r>
-        <w:t xml:space="preserve">:</w:t>
-      </w:r>
-      <w:r>
-        <w:t xml:space="preserve"> </w:t>
-      </w:r>
-      <w:r>
-        <w:t xml:space="preserve">An AI-Augmented Platform</w:t>
-      </w:r>
-      <w:r>
-        <w:t xml:space="preserve"> </w:t>
-      </w:r>
-      <w:r>
-        <w:t xml:space="preserve">for</w:t>
-      </w:r>
-      <w:r>
-        <w:t xml:space="preserve"> </w:t>
-      </w:r>
-      <w:r>
-        <w:t xml:space="preserve">Accelerating Quantitative Systems Pharmacology Model Development</w:t>
-      </w:r>
-      <w:r>
-        <w:t xml:space="preserve">.”</w:t>
-      </w:r>
-      <w:r>
-        <w:t xml:space="preserve"> </w:t>
-      </w:r>
-      <w:r>
-        <w:rPr>
-          <w:i/>
-          <w:iCs/>
-        </w:rPr>
-        <w:t xml:space="preserve">CPT: Pharmacometrics &amp; Systems Pharmacology</w:t>
-      </w:r>
-      <w:r>
-        <w:t xml:space="preserve"> </w:t>
-      </w:r>
-      <w:r>
-        <w:t xml:space="preserve">14 (11): 1775–86.</w:t>
-      </w:r>
-      <w:r>
-        <w:t xml:space="preserve"> </w:t>
-      </w:r>
-      <w:hyperlink r:id="rId106">
-        <w:r>
-          <w:rPr>
-            <w:rStyle w:val="Hyperlink"/>
-          </w:rPr>
-          <w:t xml:space="preserve">https://doi.org/10.1002/psp4.70127</w:t>
-        </w:r>
-      </w:hyperlink>
-      <w:r>
-        <w:t xml:space="preserve">.</w:t>
-      </w:r>
-    </w:p>
-    <w:bookmarkEnd w:id="107"/>
-    <w:bookmarkStart w:id="109" w:name="Xf04452bffb761e20a8d85d7ac9f2324a57864a8"/>
-    <w:p>
-      <w:pPr>
-        <w:pStyle w:val="Bibliography"/>
-      </w:pPr>
-      <w:r>
-        <w:t xml:space="preserve">Terranova, Nadia, Didier Renard, Mohamed H. Shahin, Sujatha Menon, Youfang Cao, Cornelis E. C. A. Hop, Sean Hayes, et al. 2024.</w:t>
-      </w:r>
-      <w:r>
-        <w:t xml:space="preserve"> </w:t>
-      </w:r>
-      <w:r>
-        <w:t xml:space="preserve">“Artificial</w:t>
-      </w:r>
-      <w:r>
-        <w:t xml:space="preserve"> </w:t>
-      </w:r>
-      <w:r>
-        <w:t xml:space="preserve">Intelligence</w:t>
-      </w:r>
-      <w:r>
-        <w:t xml:space="preserve"> </w:t>
-      </w:r>
-      <w:r>
-        <w:t xml:space="preserve">for</w:t>
-      </w:r>
-      <w:r>
-        <w:t xml:space="preserve"> </w:t>
-      </w:r>
-      <w:r>
-        <w:t xml:space="preserve">Quantitative Modeling</w:t>
-      </w:r>
-      <w:r>
-        <w:t xml:space="preserve"> </w:t>
-      </w:r>
-      <w:r>
-        <w:t xml:space="preserve">in</w:t>
-      </w:r>
-      <w:r>
-        <w:t xml:space="preserve"> </w:t>
-      </w:r>
-      <w:r>
-        <w:t xml:space="preserve">Drug Discovery</w:t>
-      </w:r>
-      <w:r>
-        <w:t xml:space="preserve"> </w:t>
-      </w:r>
-      <w:r>
-        <w:t xml:space="preserve">and</w:t>
-      </w:r>
-      <w:r>
-        <w:t xml:space="preserve"> </w:t>
-      </w:r>
-      <w:r>
-        <w:t xml:space="preserve">Development</w:t>
-      </w:r>
-      <w:r>
-        <w:t xml:space="preserve">:</w:t>
-      </w:r>
-      <w:r>
-        <w:t xml:space="preserve"> </w:t>
-      </w:r>
-      <w:r>
-        <w:t xml:space="preserve">An Innovation</w:t>
-      </w:r>
-      <w:r>
-        <w:t xml:space="preserve"> </w:t>
-      </w:r>
-      <w:r>
-        <w:t xml:space="preserve">and</w:t>
-      </w:r>
-      <w:r>
-        <w:t xml:space="preserve"> </w:t>
-      </w:r>
-      <w:r>
-        <w:t xml:space="preserve">Quality Consortium Perspective</w:t>
-      </w:r>
-      <w:r>
-        <w:t xml:space="preserve"> </w:t>
-      </w:r>
-      <w:r>
-        <w:t xml:space="preserve">on</w:t>
-      </w:r>
-      <w:r>
-        <w:t xml:space="preserve"> </w:t>
-      </w:r>
-      <w:r>
-        <w:t xml:space="preserve">Use Cases</w:t>
-      </w:r>
-      <w:r>
-        <w:t xml:space="preserve"> </w:t>
-      </w:r>
-      <w:r>
-        <w:t xml:space="preserve">and</w:t>
-      </w:r>
-      <w:r>
-        <w:t xml:space="preserve"> </w:t>
-      </w:r>
-      <w:r>
-        <w:t xml:space="preserve">Best Practices</w:t>
-      </w:r>
-      <w:r>
-        <w:t xml:space="preserve">.”</w:t>
-      </w:r>
-      <w:r>
-        <w:t xml:space="preserve"> </w:t>
-      </w:r>
-      <w:r>
-        <w:rPr>
-          <w:i/>
-          <w:iCs/>
-        </w:rPr>
-        <w:t xml:space="preserve">Clinical Pharmacology &amp; Therapeutics</w:t>
-      </w:r>
-      <w:r>
-        <w:t xml:space="preserve"> </w:t>
-      </w:r>
-      <w:r>
-        <w:t xml:space="preserve">115 (4): 658–72.</w:t>
-      </w:r>
-      <w:r>
-        <w:t xml:space="preserve"> </w:t>
-      </w:r>
-      <w:hyperlink r:id="rId108">
-        <w:r>
-          <w:rPr>
-            <w:rStyle w:val="Hyperlink"/>
-          </w:rPr>
-          <w:t xml:space="preserve">https://doi.org/10.1002/cpt.3053</w:t>
-        </w:r>
-      </w:hyperlink>
-      <w:r>
-        <w:t xml:space="preserve">.</w:t>
-      </w:r>
-    </w:p>
-    <w:bookmarkEnd w:id="109"/>
-    <w:bookmarkStart w:id="111" w:name="ref-wangVirtualPatientsDigital2024"/>
-    <w:p>
-      <w:pPr>
-        <w:pStyle w:val="Bibliography"/>
-      </w:pPr>
-      <w:r>
-        <w:t xml:space="preserve">Wang, Hanwen, Theinmozhi Arulraj, Alberto Ippolito, and Aleksander S. Popel. 2024.</w:t>
-      </w:r>
-      <w:r>
-        <w:t xml:space="preserve"> </w:t>
-      </w:r>
-      <w:r>
-        <w:t xml:space="preserve">“From Virtual Patients to Digital Twins in Immuno-Oncology: Lessons Learned from Mechanistic Quantitative Systems Pharmacology Modeling.”</w:t>
-      </w:r>
-      <w:r>
-        <w:t xml:space="preserve"> </w:t>
-      </w:r>
-      <w:r>
-        <w:rPr>
-          <w:i/>
-          <w:iCs/>
-        </w:rPr>
-        <w:t xml:space="preserve">Npj Digital Medicine</w:t>
-      </w:r>
-      <w:r>
-        <w:t xml:space="preserve"> </w:t>
-      </w:r>
-      <w:r>
-        <w:t xml:space="preserve">7 (1): 189.</w:t>
-      </w:r>
-      <w:r>
-        <w:t xml:space="preserve"> </w:t>
-      </w:r>
-      <w:hyperlink r:id="rId110">
-        <w:r>
-          <w:rPr>
-            <w:rStyle w:val="Hyperlink"/>
-          </w:rPr>
-          <w:t xml:space="preserve">https://doi.org/10.1038/s41746-024-01188-4</w:t>
-        </w:r>
-      </w:hyperlink>
-      <w:r>
-        <w:t xml:space="preserve">.</w:t>
-      </w:r>
-    </w:p>
-    <w:bookmarkEnd w:id="111"/>
-    <w:bookmarkStart w:id="113" w:name="X793781ed149e50493dc391e82aa31eba70e69be"/>
-    <w:p>
-      <w:pPr>
-        <w:pStyle w:val="Bibliography"/>
-      </w:pPr>
-      <w:r>
-        <w:t xml:space="preserve">———. 2025.</w:t>
-      </w:r>
-      <w:r>
-        <w:t xml:space="preserve"> </w:t>
-      </w:r>
-      <w:r>
-        <w:t xml:space="preserve">“Quantitative</w:t>
-      </w:r>
-      <w:r>
-        <w:t xml:space="preserve"> </w:t>
-      </w:r>
-      <w:r>
-        <w:t xml:space="preserve">Systems Pharmacology Modeling</w:t>
-      </w:r>
-      <w:r>
-        <w:t xml:space="preserve"> </w:t>
-      </w:r>
-      <w:r>
-        <w:t xml:space="preserve">in</w:t>
-      </w:r>
-      <w:r>
-        <w:t xml:space="preserve"> </w:t>
-      </w:r>
-      <w:r>
-        <w:t xml:space="preserve">Immuno-Oncology</w:t>
-      </w:r>
-      <w:r>
-        <w:t xml:space="preserve">:</w:t>
-      </w:r>
-      <w:r>
-        <w:t xml:space="preserve"> </w:t>
-      </w:r>
-      <w:r>
-        <w:t xml:space="preserve">Hypothesis Testing</w:t>
-      </w:r>
-      <w:r>
-        <w:t xml:space="preserve">,</w:t>
-      </w:r>
-      <w:r>
-        <w:t xml:space="preserve"> </w:t>
-      </w:r>
-      <w:r>
-        <w:t xml:space="preserve">Dose Optimization</w:t>
-      </w:r>
-      <w:r>
-        <w:t xml:space="preserve">, and</w:t>
-      </w:r>
-      <w:r>
-        <w:t xml:space="preserve"> </w:t>
-      </w:r>
-      <w:r>
-        <w:t xml:space="preserve">Efficacy Prediction</w:t>
-      </w:r>
-      <w:r>
-        <w:t xml:space="preserve">.”</w:t>
-      </w:r>
-      <w:r>
-        <w:t xml:space="preserve"> </w:t>
-      </w:r>
-      <w:r>
-        <w:rPr>
-          <w:i/>
-          <w:iCs/>
-        </w:rPr>
-        <w:t xml:space="preserve">Handbook of Experimental Pharmacology</w:t>
-      </w:r>
-      <w:r>
-        <w:t xml:space="preserve"> </w:t>
-      </w:r>
-      <w:r>
-        <w:t xml:space="preserve">289: 261–84.</w:t>
-      </w:r>
-      <w:r>
-        <w:t xml:space="preserve"> </w:t>
-      </w:r>
-      <w:hyperlink r:id="rId112">
-        <w:r>
-          <w:rPr>
-            <w:rStyle w:val="Hyperlink"/>
-          </w:rPr>
-          <w:t xml:space="preserve">https://doi.org/10.1007/164_2024_735</w:t>
-        </w:r>
-      </w:hyperlink>
-      <w:r>
-        <w:t xml:space="preserve">.</w:t>
-      </w:r>
-    </w:p>
-    <w:bookmarkEnd w:id="113"/>
-    <w:bookmarkStart w:id="115" w:name="X80b850b1fae475c21ff68b6cd4ad6c287df98b4"/>
-    <w:p>
-      <w:pPr>
-        <w:pStyle w:val="Bibliography"/>
-      </w:pPr>
-      <w:r>
-        <w:t xml:space="preserve">Wang, Xingbo, Samantha L. Huey, Rui Sheng, Saurabh Mehta, and Fei Wang. 2025.</w:t>
-      </w:r>
-      <w:r>
-        <w:t xml:space="preserve"> </w:t>
-      </w:r>
-      <w:r>
-        <w:t xml:space="preserve">“</w:t>
-      </w:r>
-      <w:r>
-        <w:t xml:space="preserve">SciDaSynth</w:t>
-      </w:r>
-      <w:r>
-        <w:t xml:space="preserve">:</w:t>
-      </w:r>
-      <w:r>
-        <w:t xml:space="preserve"> </w:t>
-      </w:r>
-      <w:r>
-        <w:t xml:space="preserve">Interactive Structured Data Extraction From Scientific Literature With Large Language Model</w:t>
-      </w:r>
-      <w:r>
-        <w:t xml:space="preserve">.”</w:t>
-      </w:r>
-      <w:r>
-        <w:t xml:space="preserve"> </w:t>
-      </w:r>
-      <w:r>
-        <w:rPr>
-          <w:i/>
-          <w:iCs/>
-        </w:rPr>
-        <w:t xml:space="preserve">Campbell Systematic Reviews</w:t>
-      </w:r>
-      <w:r>
-        <w:t xml:space="preserve"> </w:t>
-      </w:r>
-      <w:r>
-        <w:t xml:space="preserve">21 (4): e70073.</w:t>
-      </w:r>
-      <w:r>
-        <w:t xml:space="preserve"> </w:t>
-      </w:r>
-      <w:hyperlink r:id="rId114">
-        <w:r>
-          <w:rPr>
-            <w:rStyle w:val="Hyperlink"/>
-          </w:rPr>
-          <w:t xml:space="preserve">https://doi.org/10.1002/cl2.70073</w:t>
-        </w:r>
-      </w:hyperlink>
-      <w:r>
-        <w:t xml:space="preserve">.</w:t>
-      </w:r>
-    </w:p>
-    <w:bookmarkEnd w:id="115"/>
-    <w:bookmarkStart w:id="117" w:name="Xc2db48aace4a03f6778539446eca6b2173fde89"/>
-    <w:p>
-      <w:pPr>
-        <w:pStyle w:val="Bibliography"/>
-      </w:pPr>
-      <w:r>
-        <w:t xml:space="preserve">Zhang, Shuming, Hanwen Wang, Yeonju Cho, Wendy Wong, Mark Yarchoan, Elizabeth M. Jaffee, Won Jin Ho, et al. 2025.</w:t>
-      </w:r>
-      <w:r>
-        <w:t xml:space="preserve"> </w:t>
-      </w:r>
-      <w:r>
-        <w:t xml:space="preserve">“Quantitative</w:t>
-      </w:r>
-      <w:r>
-        <w:t xml:space="preserve"> </w:t>
-      </w:r>
-      <w:r>
-        <w:t xml:space="preserve">Calibration</w:t>
-      </w:r>
-      <w:r>
-        <w:t xml:space="preserve"> </w:t>
-      </w:r>
-      <w:r>
-        <w:t xml:space="preserve">of a</w:t>
-      </w:r>
-      <w:r>
-        <w:t xml:space="preserve"> </w:t>
-      </w:r>
-      <w:r>
-        <w:t xml:space="preserve">Spatial QSP Model Identifies Fibroblast Impact</w:t>
-      </w:r>
-      <w:r>
-        <w:t xml:space="preserve"> </w:t>
-      </w:r>
-      <w:r>
-        <w:t xml:space="preserve">on</w:t>
-      </w:r>
-      <w:r>
-        <w:t xml:space="preserve"> </w:t>
-      </w:r>
-      <w:r>
-        <w:t xml:space="preserve">HCC Immunotherapy</w:t>
-      </w:r>
-      <w:r>
-        <w:t xml:space="preserve">.”</w:t>
-      </w:r>
-      <w:r>
-        <w:t xml:space="preserve"> </w:t>
-      </w:r>
-      <w:r>
-        <w:rPr>
-          <w:i/>
-          <w:iCs/>
-        </w:rPr>
-        <w:t xml:space="preserve">bioRxiv</w:t>
-      </w:r>
-      <w:r>
-        <w:t xml:space="preserve">, November, 2025.10.31.685939.</w:t>
-      </w:r>
-      <w:r>
-        <w:t xml:space="preserve"> </w:t>
-      </w:r>
-      <w:hyperlink r:id="rId116">
-        <w:r>
-          <w:rPr>
-            <w:rStyle w:val="Hyperlink"/>
-          </w:rPr>
-          <w:t xml:space="preserve">https://doi.org/10.1101/2025.10.31.685939</w:t>
-        </w:r>
-      </w:hyperlink>
-      <w:r>
-        <w:t xml:space="preserve">.</w:t>
-      </w:r>
-    </w:p>
-    <w:bookmarkEnd w:id="117"/>
-    <w:bookmarkStart w:id="119" w:name="ref-zhaoRecentAdvancesBiomedical2021"/>
-    <w:p>
-      <w:pPr>
-        <w:pStyle w:val="Bibliography"/>
-      </w:pPr>
-      <w:r>
-        <w:t xml:space="preserve">Zhao, Sendong, Chang Su, Zhiyong Lu, and Fei Wang. 2021.</w:t>
-      </w:r>
-      <w:r>
-        <w:t xml:space="preserve"> </w:t>
-      </w:r>
-      <w:r>
-        <w:t xml:space="preserve">“Recent Advances in Biomedical Literature Mining.”</w:t>
-      </w:r>
-      <w:r>
-        <w:t xml:space="preserve"> </w:t>
-      </w:r>
-      <w:r>
-        <w:rPr>
-          <w:i/>
-          <w:iCs/>
-        </w:rPr>
-        <w:t xml:space="preserve">Briefings in Bioinformatics</w:t>
-      </w:r>
-      <w:r>
-        <w:t xml:space="preserve"> </w:t>
-      </w:r>
-      <w:r>
-        <w:t xml:space="preserve">22 (3): bbaa057.</w:t>
-      </w:r>
-      <w:r>
-        <w:t xml:space="preserve"> </w:t>
-      </w:r>
-      <w:hyperlink r:id="rId118">
-        <w:r>
-          <w:rPr>
-            <w:rStyle w:val="Hyperlink"/>
-          </w:rPr>
-          <w:t xml:space="preserve">https://doi.org/10.1093/bib/bbaa057</w:t>
-        </w:r>
-      </w:hyperlink>
-      <w:r>
-        <w:t xml:space="preserve">.</w:t>
-      </w:r>
-    </w:p>
-    <w:bookmarkEnd w:id="119"/>
-    <w:bookmarkEnd w:id="120"/>
-    <w:bookmarkEnd w:id="121"/>
+    </w:p>
+    <w:bookmarkEnd w:id="130"/>
+    <w:bookmarkEnd w:id="131"/>
+    <w:bookmarkEnd w:id="132"/>
     <w:sectPr>
       <w:footnotePr>
         <w:numRestart w:val="eachSect"/>
@@ -5952,6 +5762,10 @@
   <w:style w:default="1" w:styleId="Normal" w:type="paragraph">
     <w:name w:val="Normal"/>
     <w:qFormat/>
+    <w:rPr>
+      <w:rFonts w:ascii="Arial" w:hAnsi="Arial"/>
+      <w:sz w:val="22"/>
+    </w:rPr>
   </w:style>
   <w:style w:styleId="BodyText" w:type="paragraph">
     <w:name w:val="Body Text"/>
@@ -5961,12 +5775,20 @@
     <w:pPr>
       <w:spacing w:after="180" w:before="180"/>
     </w:pPr>
+    <w:rPr>
+      <w:rFonts w:ascii="Arial" w:hAnsi="Arial"/>
+      <w:sz w:val="22"/>
+    </w:rPr>
   </w:style>
   <w:style w:customStyle="1" w:styleId="FirstParagraph" w:type="paragraph">
     <w:name w:val="First Paragraph"/>
     <w:basedOn w:val="BodyText"/>
     <w:next w:val="BodyText"/>
     <w:qFormat/>
+    <w:rPr>
+      <w:rFonts w:ascii="Arial" w:hAnsi="Arial"/>
+      <w:sz w:val="22"/>
+    </w:rPr>
   </w:style>
   <w:style w:customStyle="1" w:styleId="Compact" w:type="paragraph">
     <w:name w:val="Compact"/>
@@ -5975,6 +5797,10 @@
     <w:pPr>
       <w:spacing w:after="36" w:before="36"/>
     </w:pPr>
+    <w:rPr>
+      <w:rFonts w:ascii="Arial" w:hAnsi="Arial"/>
+      <w:sz w:val="22"/>
+    </w:rPr>
   </w:style>
   <w:style w:styleId="Title" w:type="paragraph">
     <w:name w:val="Title"/>
@@ -5990,10 +5816,11 @@
       <w:jc w:val="center"/>
     </w:pPr>
     <w:rPr>
-      <w:rFonts w:asciiTheme="majorHAnsi" w:cstheme="majorBidi" w:eastAsiaTheme="majorEastAsia" w:hAnsiTheme="majorHAnsi"/>
+      <w:rFonts w:ascii="Arial" w:asciiTheme="majorHAnsi" w:cstheme="majorBidi" w:eastAsiaTheme="majorEastAsia" w:hAnsi="Arial" w:hAnsiTheme="majorHAnsi"/>
+      <w:b/>
       <w:spacing w:val="-10"/>
       <w:kern w:val="28"/>
-      <w:sz w:val="56"/>
+      <w:sz w:val="40"/>
       <w:szCs w:val="56"/>
     </w:rPr>
   </w:style>
@@ -6004,10 +5831,10 @@
     <w:uiPriority w:val="10"/>
     <w:rsid w:val="00A10FD9"/>
     <w:rPr>
-      <w:rFonts w:asciiTheme="majorHAnsi" w:cstheme="majorBidi" w:eastAsiaTheme="majorEastAsia" w:hAnsiTheme="majorHAnsi"/>
+      <w:rFonts w:ascii="Arial" w:asciiTheme="majorHAnsi" w:cstheme="majorBidi" w:eastAsiaTheme="majorEastAsia" w:hAnsi="Arial" w:hAnsiTheme="majorHAnsi"/>
       <w:spacing w:val="-10"/>
       <w:kern w:val="28"/>
-      <w:sz w:val="56"/>
+      <w:sz w:val="22"/>
       <w:szCs w:val="56"/>
     </w:rPr>
   </w:style>
@@ -6025,9 +5852,9 @@
       </w:numPr>
     </w:pPr>
     <w:rPr>
-      <w:rFonts w:cstheme="majorBidi" w:eastAsiaTheme="majorEastAsia"/>
+      <w:rFonts w:ascii="Arial" w:cstheme="majorBidi" w:eastAsiaTheme="majorEastAsia" w:hAnsi="Arial"/>
       <w:spacing w:val="15"/>
-      <w:sz w:val="28"/>
+      <w:sz w:val="22"/>
       <w:szCs w:val="28"/>
     </w:rPr>
   </w:style>
@@ -6038,10 +5865,10 @@
     <w:uiPriority w:val="11"/>
     <w:rsid w:val="00A10FD9"/>
     <w:rPr>
-      <w:rFonts w:cstheme="majorBidi" w:eastAsiaTheme="majorEastAsia"/>
+      <w:rFonts w:ascii="Arial" w:cstheme="majorBidi" w:eastAsiaTheme="majorEastAsia" w:hAnsi="Arial"/>
       <w:color w:themeColor="text1" w:themeTint="A6" w:val="595959"/>
       <w:spacing w:val="15"/>
-      <w:sz w:val="28"/>
+      <w:sz w:val="22"/>
       <w:szCs w:val="28"/>
     </w:rPr>
   </w:style>
@@ -6054,6 +5881,10 @@
       <w:keepLines/>
       <w:jc w:val="center"/>
     </w:pPr>
+    <w:rPr>
+      <w:rFonts w:ascii="Arial" w:hAnsi="Arial"/>
+      <w:sz w:val="22"/>
+    </w:rPr>
   </w:style>
   <w:style w:styleId="Date" w:type="paragraph">
     <w:name w:val="Date"/>
@@ -6064,6 +5895,10 @@
       <w:keepLines/>
       <w:jc w:val="center"/>
     </w:pPr>
+    <w:rPr>
+      <w:rFonts w:ascii="Arial" w:hAnsi="Arial"/>
+      <w:sz w:val="22"/>
+    </w:rPr>
   </w:style>
   <w:style w:customStyle="1" w:styleId="AbstractTitle" w:type="paragraph">
     <w:name w:val="Abstract Title"/>
@@ -6077,8 +5912,9 @@
       <w:jc w:val="center"/>
     </w:pPr>
     <w:rPr>
+      <w:rFonts w:ascii="Arial" w:hAnsi="Arial"/>
       <w:b/>
-      <w:sz w:val="20"/>
+      <w:sz w:val="22"/>
       <w:szCs w:val="20"/>
     </w:rPr>
   </w:style>
@@ -6093,7 +5929,8 @@
       <w:spacing w:after="300" w:before="100"/>
     </w:pPr>
     <w:rPr>
-      <w:sz w:val="20"/>
+      <w:rFonts w:ascii="Arial" w:hAnsi="Arial"/>
+      <w:sz w:val="22"/>
       <w:szCs w:val="20"/>
     </w:rPr>
   </w:style>
@@ -6103,7 +5940,10 @@
     <w:next w:val="Bibliography"/>
     <w:qFormat/>
     <w:pPr/>
-    <w:rPr/>
+    <w:rPr>
+      <w:rFonts w:ascii="Arial" w:hAnsi="Arial"/>
+      <w:sz w:val="22"/>
+    </w:rPr>
   </w:style>
   <w:style w:styleId="Heading1" w:type="paragraph">
     <w:name w:val="heading 1"/>
@@ -6120,9 +5960,10 @@
       <w:outlineLvl w:val="0"/>
     </w:pPr>
     <w:rPr>
-      <w:rFonts w:asciiTheme="majorHAnsi" w:cstheme="majorBidi" w:eastAsiaTheme="majorEastAsia" w:hAnsiTheme="majorHAnsi"/>
+      <w:rFonts w:ascii="Arial" w:asciiTheme="majorHAnsi" w:cstheme="majorBidi" w:eastAsiaTheme="majorEastAsia" w:hAnsi="Arial" w:hAnsiTheme="majorHAnsi"/>
+      <w:b/>
       <w:color w:themeColor="accent1" w:themeShade="BF" w:val="0F4761"/>
-      <w:sz w:val="40"/>
+      <w:sz w:val="32"/>
       <w:szCs w:val="40"/>
     </w:rPr>
   </w:style>
@@ -6143,9 +5984,10 @@
       <w:outlineLvl w:val="1"/>
     </w:pPr>
     <w:rPr>
-      <w:rFonts w:asciiTheme="majorHAnsi" w:cstheme="majorBidi" w:eastAsiaTheme="majorEastAsia" w:hAnsiTheme="majorHAnsi"/>
+      <w:rFonts w:ascii="Arial" w:asciiTheme="majorHAnsi" w:cstheme="majorBidi" w:eastAsiaTheme="majorEastAsia" w:hAnsi="Arial" w:hAnsiTheme="majorHAnsi"/>
+      <w:b/>
       <w:color w:themeColor="accent1" w:themeShade="BF" w:val="0F4761"/>
-      <w:sz w:val="32"/>
+      <w:sz w:val="28"/>
       <w:szCs w:val="32"/>
     </w:rPr>
   </w:style>
@@ -6166,9 +6008,10 @@
       <w:outlineLvl w:val="2"/>
     </w:pPr>
     <w:rPr>
-      <w:rFonts w:cstheme="majorBidi" w:eastAsiaTheme="majorEastAsia"/>
+      <w:rFonts w:ascii="Arial" w:cstheme="majorBidi" w:eastAsiaTheme="majorEastAsia" w:hAnsi="Arial"/>
+      <w:b/>
       <w:color w:themeColor="accent1" w:themeShade="BF" w:val="0F4761"/>
-      <w:sz w:val="28"/>
+      <w:sz w:val="24"/>
       <w:szCs w:val="28"/>
     </w:rPr>
   </w:style>
@@ -6189,10 +6032,12 @@
       <w:outlineLvl w:val="3"/>
     </w:pPr>
     <w:rPr>
-      <w:rFonts w:cstheme="majorBidi" w:eastAsiaTheme="majorEastAsia"/>
+      <w:rFonts w:ascii="Arial" w:cstheme="majorBidi" w:eastAsiaTheme="majorEastAsia" w:hAnsi="Arial"/>
+      <w:b/>
       <w:i/>
       <w:iCs/>
       <w:color w:themeColor="accent1" w:themeShade="BF" w:val="0F4761"/>
+      <w:sz w:val="22"/>
     </w:rPr>
   </w:style>
   <w:style w:styleId="Heading5" w:type="paragraph">
@@ -6212,8 +6057,10 @@
       <w:outlineLvl w:val="4"/>
     </w:pPr>
     <w:rPr>
-      <w:rFonts w:cstheme="majorBidi" w:eastAsiaTheme="majorEastAsia"/>
+      <w:rFonts w:ascii="Arial" w:cstheme="majorBidi" w:eastAsiaTheme="majorEastAsia" w:hAnsi="Arial"/>
+      <w:b/>
       <w:color w:themeColor="accent1" w:themeShade="BF" w:val="0F4761"/>
+      <w:sz w:val="22"/>
     </w:rPr>
   </w:style>
   <w:style w:styleId="Heading6" w:type="paragraph">
@@ -6233,10 +6080,11 @@
       <w:outlineLvl w:val="5"/>
     </w:pPr>
     <w:rPr>
-      <w:rFonts w:cstheme="majorBidi" w:eastAsiaTheme="majorEastAsia"/>
+      <w:rFonts w:ascii="Arial" w:cstheme="majorBidi" w:eastAsiaTheme="majorEastAsia" w:hAnsi="Arial"/>
       <w:i/>
       <w:iCs/>
       <w:color w:themeColor="text1" w:themeTint="A6" w:val="595959"/>
+      <w:sz w:val="22"/>
     </w:rPr>
   </w:style>
   <w:style w:styleId="Heading7" w:type="paragraph">
@@ -6256,8 +6104,9 @@
       <w:outlineLvl w:val="6"/>
     </w:pPr>
     <w:rPr>
-      <w:rFonts w:cstheme="majorBidi" w:eastAsiaTheme="majorEastAsia"/>
+      <w:rFonts w:ascii="Arial" w:cstheme="majorBidi" w:eastAsiaTheme="majorEastAsia" w:hAnsi="Arial"/>
       <w:color w:themeColor="text1" w:themeTint="A6" w:val="595959"/>
+      <w:sz w:val="22"/>
     </w:rPr>
   </w:style>
   <w:style w:styleId="Heading8" w:type="paragraph">
@@ -6277,10 +6126,11 @@
       <w:outlineLvl w:val="7"/>
     </w:pPr>
     <w:rPr>
-      <w:rFonts w:cstheme="majorBidi" w:eastAsiaTheme="majorEastAsia"/>
+      <w:rFonts w:ascii="Arial" w:cstheme="majorBidi" w:eastAsiaTheme="majorEastAsia" w:hAnsi="Arial"/>
       <w:i/>
       <w:iCs/>
       <w:color w:themeColor="text1" w:themeTint="D8" w:val="272727"/>
+      <w:sz w:val="22"/>
     </w:rPr>
   </w:style>
   <w:style w:styleId="Heading9" w:type="paragraph">
@@ -6300,8 +6150,9 @@
       <w:outlineLvl w:val="8"/>
     </w:pPr>
     <w:rPr>
-      <w:rFonts w:cstheme="majorBidi" w:eastAsiaTheme="majorEastAsia"/>
+      <w:rFonts w:ascii="Arial" w:cstheme="majorBidi" w:eastAsiaTheme="majorEastAsia" w:hAnsi="Arial"/>
       <w:color w:themeColor="text1" w:themeTint="D8" w:val="272727"/>
+      <w:sz w:val="22"/>
     </w:rPr>
   </w:style>
   <w:style w:customStyle="1" w:styleId="Heading1Char" w:type="character">
@@ -6311,9 +6162,9 @@
     <w:uiPriority w:val="9"/>
     <w:rsid w:val="00A10FD9"/>
     <w:rPr>
-      <w:rFonts w:asciiTheme="majorHAnsi" w:cstheme="majorBidi" w:eastAsiaTheme="majorEastAsia" w:hAnsiTheme="majorHAnsi"/>
+      <w:rFonts w:ascii="Arial" w:asciiTheme="majorHAnsi" w:cstheme="majorBidi" w:eastAsiaTheme="majorEastAsia" w:hAnsi="Arial" w:hAnsiTheme="majorHAnsi"/>
       <w:color w:themeColor="accent1" w:themeShade="BF" w:val="0F4761"/>
-      <w:sz w:val="40"/>
+      <w:sz w:val="22"/>
       <w:szCs w:val="40"/>
     </w:rPr>
   </w:style>
@@ -6325,9 +6176,9 @@
     <w:semiHidden/>
     <w:rsid w:val="00A10FD9"/>
     <w:rPr>
-      <w:rFonts w:asciiTheme="majorHAnsi" w:cstheme="majorBidi" w:eastAsiaTheme="majorEastAsia" w:hAnsiTheme="majorHAnsi"/>
+      <w:rFonts w:ascii="Arial" w:asciiTheme="majorHAnsi" w:cstheme="majorBidi" w:eastAsiaTheme="majorEastAsia" w:hAnsi="Arial" w:hAnsiTheme="majorHAnsi"/>
       <w:color w:themeColor="accent1" w:themeShade="BF" w:val="0F4761"/>
-      <w:sz w:val="32"/>
+      <w:sz w:val="22"/>
       <w:szCs w:val="32"/>
     </w:rPr>
   </w:style>
@@ -6339,9 +6190,9 @@
     <w:semiHidden/>
     <w:rsid w:val="00A10FD9"/>
     <w:rPr>
-      <w:rFonts w:cstheme="majorBidi" w:eastAsiaTheme="majorEastAsia"/>
+      <w:rFonts w:ascii="Arial" w:cstheme="majorBidi" w:eastAsiaTheme="majorEastAsia" w:hAnsi="Arial"/>
       <w:color w:themeColor="accent1" w:themeShade="BF" w:val="0F4761"/>
-      <w:sz w:val="28"/>
+      <w:sz w:val="22"/>
       <w:szCs w:val="28"/>
     </w:rPr>
   </w:style>
@@ -6353,10 +6204,11 @@
     <w:semiHidden/>
     <w:rsid w:val="00A10FD9"/>
     <w:rPr>
-      <w:rFonts w:cstheme="majorBidi" w:eastAsiaTheme="majorEastAsia"/>
+      <w:rFonts w:ascii="Arial" w:cstheme="majorBidi" w:eastAsiaTheme="majorEastAsia" w:hAnsi="Arial"/>
       <w:i/>
       <w:iCs/>
       <w:color w:themeColor="accent1" w:themeShade="BF" w:val="0F4761"/>
+      <w:sz w:val="22"/>
     </w:rPr>
   </w:style>
   <w:style w:customStyle="1" w:styleId="Heading5Char" w:type="character">
@@ -6367,8 +6219,9 @@
     <w:semiHidden/>
     <w:rsid w:val="00A10FD9"/>
     <w:rPr>
-      <w:rFonts w:cstheme="majorBidi" w:eastAsiaTheme="majorEastAsia"/>
+      <w:rFonts w:ascii="Arial" w:cstheme="majorBidi" w:eastAsiaTheme="majorEastAsia" w:hAnsi="Arial"/>
       <w:color w:themeColor="accent1" w:themeShade="BF" w:val="0F4761"/>
+      <w:sz w:val="22"/>
     </w:rPr>
   </w:style>
   <w:style w:customStyle="1" w:styleId="Heading6Char" w:type="character">
@@ -6379,10 +6232,11 @@
     <w:semiHidden/>
     <w:rsid w:val="00A10FD9"/>
     <w:rPr>
-      <w:rFonts w:cstheme="majorBidi" w:eastAsiaTheme="majorEastAsia"/>
+      <w:rFonts w:ascii="Arial" w:cstheme="majorBidi" w:eastAsiaTheme="majorEastAsia" w:hAnsi="Arial"/>
       <w:i/>
       <w:iCs/>
       <w:color w:themeColor="text1" w:themeTint="A6" w:val="595959"/>
+      <w:sz w:val="22"/>
     </w:rPr>
   </w:style>
   <w:style w:customStyle="1" w:styleId="Heading7Char" w:type="character">
@@ -6393,8 +6247,9 @@
     <w:semiHidden/>
     <w:rsid w:val="00A10FD9"/>
     <w:rPr>
-      <w:rFonts w:cstheme="majorBidi" w:eastAsiaTheme="majorEastAsia"/>
+      <w:rFonts w:ascii="Arial" w:cstheme="majorBidi" w:eastAsiaTheme="majorEastAsia" w:hAnsi="Arial"/>
       <w:color w:themeColor="text1" w:themeTint="A6" w:val="595959"/>
+      <w:sz w:val="22"/>
     </w:rPr>
   </w:style>
   <w:style w:customStyle="1" w:styleId="Heading8Char" w:type="character">
@@ -6405,10 +6260,11 @@
     <w:semiHidden/>
     <w:rsid w:val="00A10FD9"/>
     <w:rPr>
-      <w:rFonts w:cstheme="majorBidi" w:eastAsiaTheme="majorEastAsia"/>
+      <w:rFonts w:ascii="Arial" w:cstheme="majorBidi" w:eastAsiaTheme="majorEastAsia" w:hAnsi="Arial"/>
       <w:i/>
       <w:iCs/>
       <w:color w:themeColor="text1" w:themeTint="D8" w:val="272727"/>
+      <w:sz w:val="22"/>
     </w:rPr>
   </w:style>
   <w:style w:customStyle="1" w:styleId="Heading9Char" w:type="character">
@@ -6419,8 +6275,9 @@
     <w:semiHidden/>
     <w:rsid w:val="00A10FD9"/>
     <w:rPr>
-      <w:rFonts w:cstheme="majorBidi" w:eastAsiaTheme="majorEastAsia"/>
+      <w:rFonts w:ascii="Arial" w:cstheme="majorBidi" w:eastAsiaTheme="majorEastAsia" w:hAnsi="Arial"/>
       <w:color w:themeColor="text1" w:themeTint="D8" w:val="272727"/>
+      <w:sz w:val="22"/>
     </w:rPr>
   </w:style>
   <w:style w:styleId="BlockText" w:type="paragraph">
@@ -6434,6 +6291,10 @@
       <w:spacing w:after="100" w:before="100"/>
       <w:ind w:firstLine="0" w:left="480" w:right="480"/>
     </w:pPr>
+    <w:rPr>
+      <w:rFonts w:ascii="Arial" w:hAnsi="Arial"/>
+      <w:sz w:val="22"/>
+    </w:rPr>
   </w:style>
   <w:style w:styleId="FootnoteText" w:type="paragraph">
     <w:name w:val="Footnote Text"/>
@@ -6442,6 +6303,10 @@
     <w:uiPriority w:val="9"/>
     <w:unhideWhenUsed/>
     <w:qFormat/>
+    <w:rPr>
+      <w:rFonts w:ascii="Arial" w:hAnsi="Arial"/>
+      <w:sz w:val="22"/>
+    </w:rPr>
   </w:style>
   <w:style w:styleId="FootnoteBlockText" w:type="paragraph">
     <w:name w:val="Footnote Block Text"/>
@@ -6454,11 +6319,19 @@
       <w:spacing w:after="100" w:before="100"/>
       <w:ind w:firstLine="0" w:left="480" w:right="480"/>
     </w:pPr>
+    <w:rPr>
+      <w:rFonts w:ascii="Arial" w:hAnsi="Arial"/>
+      <w:sz w:val="22"/>
+    </w:rPr>
   </w:style>
   <w:style w:default="1" w:styleId="DefaultParagraphFont" w:type="character">
     <w:name w:val="Default Paragraph Font"/>
     <w:semiHidden/>
     <w:unhideWhenUsed/>
+    <w:rPr>
+      <w:rFonts w:ascii="Arial" w:hAnsi="Arial"/>
+      <w:sz w:val="22"/>
+    </w:rPr>
   </w:style>
   <w:style w:default="1" w:styleId="Table" w:type="table">
     <w:name w:val="Table"/>
@@ -6466,6 +6339,10 @@
     <w:semiHidden/>
     <w:unhideWhenUsed/>
     <w:qFormat/>
+    <w:rPr>
+      <w:rFonts w:ascii="Arial" w:hAnsi="Arial"/>
+      <w:sz w:val="22"/>
+    </w:rPr>
     <w:tblPr>
       <w:tblInd w:type="dxa" w:w="0"/>
       <w:tblCellMar>
@@ -6474,6 +6351,14 @@
         <w:bottom w:type="dxa" w:w="0"/>
         <w:right w:type="dxa" w:w="108"/>
       </w:tblCellMar>
+      <w:tblBorders>
+        <w:top w:color="000000" w:space="0" w:sz="4" w:val="single"/>
+        <w:left w:color="000000" w:space="0" w:sz="4" w:val="single"/>
+        <w:bottom w:color="000000" w:space="0" w:sz="4" w:val="single"/>
+        <w:right w:color="000000" w:space="0" w:sz="4" w:val="single"/>
+        <w:insideH w:color="000000" w:space="0" w:sz="4" w:val="single"/>
+        <w:insideV w:color="000000" w:space="0" w:sz="4" w:val="single"/>
+      </w:tblBorders>
     </w:tblPr>
     <w:tblStylePr w:type="firstRow">
       <w:tblPr>
@@ -6501,12 +6386,18 @@
       <w:spacing w:after="0"/>
     </w:pPr>
     <w:rPr>
+      <w:rFonts w:ascii="Arial" w:hAnsi="Arial"/>
       <w:b/>
+      <w:sz w:val="22"/>
     </w:rPr>
   </w:style>
   <w:style w:customStyle="1" w:styleId="Definition" w:type="paragraph">
     <w:name w:val="Definition"/>
     <w:basedOn w:val="Normal"/>
+    <w:rPr>
+      <w:rFonts w:ascii="Arial" w:hAnsi="Arial"/>
+      <w:sz w:val="22"/>
+    </w:rPr>
   </w:style>
   <w:style w:styleId="Caption" w:type="paragraph">
     <w:name w:val="Caption"/>
@@ -6516,7 +6407,10 @@
       <w:spacing w:after="120" w:before="0"/>
     </w:pPr>
     <w:rPr>
+      <w:rFonts w:ascii="Arial" w:hAnsi="Arial"/>
       <w:i/>
+      <w:color w:val="333333"/>
+      <w:sz w:val="20"/>
     </w:rPr>
   </w:style>
   <w:style w:customStyle="1" w:styleId="TableCaption" w:type="paragraph">
@@ -6525,14 +6419,30 @@
     <w:pPr>
       <w:keepNext/>
     </w:pPr>
+    <w:rPr>
+      <w:rFonts w:ascii="Arial" w:hAnsi="Arial"/>
+      <w:i/>
+      <w:color w:val="333333"/>
+      <w:sz w:val="20"/>
+    </w:rPr>
   </w:style>
   <w:style w:customStyle="1" w:styleId="ImageCaption" w:type="paragraph">
     <w:name w:val="Image Caption"/>
     <w:basedOn w:val="Caption"/>
+    <w:rPr>
+      <w:rFonts w:ascii="Arial" w:hAnsi="Arial"/>
+      <w:i/>
+      <w:color w:val="333333"/>
+      <w:sz w:val="20"/>
+    </w:rPr>
   </w:style>
   <w:style w:customStyle="1" w:styleId="Figure" w:type="paragraph">
     <w:name w:val="Figure"/>
     <w:basedOn w:val="Normal"/>
+    <w:rPr>
+      <w:rFonts w:ascii="Arial" w:hAnsi="Arial"/>
+      <w:sz w:val="22"/>
+    </w:rPr>
   </w:style>
   <w:style w:customStyle="1" w:styleId="CaptionedFigure" w:type="paragraph">
     <w:name w:val="Captioned Figure"/>
@@ -6540,28 +6450,42 @@
     <w:pPr>
       <w:keepNext/>
     </w:pPr>
+    <w:rPr>
+      <w:rFonts w:ascii="Arial" w:hAnsi="Arial"/>
+      <w:sz w:val="22"/>
+    </w:rPr>
   </w:style>
   <w:style w:customStyle="1" w:styleId="BodyTextChar" w:type="character">
     <w:name w:val="Body Text Char"/>
     <w:basedOn w:val="DefaultParagraphFont"/>
     <w:link w:val="BodyText"/>
+    <w:rPr>
+      <w:rFonts w:ascii="Arial" w:hAnsi="Arial"/>
+      <w:sz w:val="22"/>
+    </w:rPr>
   </w:style>
   <w:style w:customStyle="1" w:styleId="VerbatimChar" w:type="character">
     <w:name w:val="Verbatim Char"/>
     <w:basedOn w:val="BodyTextChar"/>
     <w:rPr>
-      <w:rFonts w:ascii="Consolas" w:hAnsi="Consolas"/>
+      <w:rFonts w:ascii="Arial" w:hAnsi="Arial"/>
       <w:sz w:val="22"/>
     </w:rPr>
   </w:style>
   <w:style w:customStyle="1" w:styleId="SectionNumber" w:type="character">
     <w:name w:val="Section Number"/>
     <w:basedOn w:val="BodyTextChar"/>
+    <w:rPr>
+      <w:rFonts w:ascii="Arial" w:hAnsi="Arial"/>
+      <w:sz w:val="22"/>
+    </w:rPr>
   </w:style>
   <w:style w:styleId="FootnoteReference" w:type="character">
     <w:name w:val="Footnote Reference"/>
     <w:basedOn w:val="BodyTextChar"/>
     <w:rPr>
+      <w:rFonts w:ascii="Arial" w:hAnsi="Arial"/>
+      <w:sz w:val="22"/>
       <w:vertAlign w:val="superscript"/>
     </w:rPr>
   </w:style>
@@ -6569,7 +6493,9 @@
     <w:name w:val="Hyperlink"/>
     <w:basedOn w:val="BodyTextChar"/>
     <w:rPr>
+      <w:rFonts w:ascii="Arial" w:hAnsi="Arial"/>
       <w:color w:themeColor="accent1" w:val="4F81BD"/>
+      <w:sz w:val="22"/>
     </w:rPr>
   </w:style>
   <w:style w:styleId="TOCHeading" w:type="paragraph">
@@ -6584,10 +6510,11 @@
       <w:outlineLvl w:val="9"/>
     </w:pPr>
     <w:rPr>
-      <w:rFonts w:asciiTheme="majorHAnsi" w:cstheme="majorBidi" w:eastAsiaTheme="majorEastAsia" w:hAnsiTheme="majorHAnsi"/>
+      <w:rFonts w:ascii="Arial" w:asciiTheme="majorHAnsi" w:cstheme="majorBidi" w:eastAsiaTheme="majorEastAsia" w:hAnsi="Arial" w:hAnsiTheme="majorHAnsi"/>
       <w:b w:val="0"/>
       <w:bCs w:val="0"/>
       <w:color w:themeColor="accent1" w:themeShade="BF" w:val="365F91"/>
+      <w:sz w:val="22"/>
     </w:rPr>
   </w:style>
   <w:style w:type="paragraph" w:customStyle="1" w:styleId="SourceCode">

</xml_diff>

<commit_message>
Convert PDF figures to PNG in docx export for upload compatibility
</commit_message>
<xml_diff>
--- a/paper/main.docx
+++ b/paper/main.docx
@@ -2538,14 +2538,14 @@
       <w:r>
         <w:drawing>
           <wp:inline>
-            <wp:extent cx="3200400" cy="2105923"/>
+            <wp:extent cx="3200400" cy="2110671"/>
             <wp:effectExtent b="0" l="0" r="0" t="0"/>
             <wp:docPr descr="" title="" id="40" name="Picture"/>
             <a:graphic>
               <a:graphicData uri="http://schemas.openxmlformats.org/drawingml/2006/picture">
                 <pic:pic>
                   <pic:nvPicPr>
-                    <pic:cNvPr descr="generated/figures/retry_distribution.pdf" id="41" name="Picture"/>
+                    <pic:cNvPr descr="generated/figures/retry_distribution.png" id="41" name="Picture"/>
                     <pic:cNvPicPr>
                       <a:picLocks noChangeArrowheads="1" noChangeAspect="1"/>
                     </pic:cNvPicPr>
@@ -2559,7 +2559,7 @@
                   <pic:spPr bwMode="auto">
                     <a:xfrm>
                       <a:off x="0" y="0"/>
-                      <a:ext cx="3200400" cy="2105923"/>
+                      <a:ext cx="3200400" cy="2110671"/>
                     </a:xfrm>
                     <a:prstGeom prst="rect">
                       <a:avLst/>

</xml_diff>

<commit_message>
Broaden calibration language to include observables throughout manuscript
Update main text and supplementary to consistently describe targets as
parameters or observables, reflecting CalibrationTarget support for
clinical/in vivo endpoints that constrain the full model.
</commit_message>
<xml_diff>
--- a/paper/main.docx
+++ b/paper/main.docx
@@ -260,7 +260,7 @@
         <w:t xml:space="preserve"> </w:t>
       </w:r>
       <w:r>
-        <w:t xml:space="preserve">to refer to a structured representation of published data that captures what was measured, under what conditions, with what uncertainty, and how that measurement relates to model parameters. Some studies isolate specific mechanisms (e.g., in vitro proliferation assays, ex vivo cytotoxicity studies) and directly constrain individual parameters, while clinical and in vivo endpoints constrain the integrated model.</w:t>
+        <w:t xml:space="preserve">to refer to a structured representation of published data that captures what was measured, under what conditions, with what uncertainty, and how that measurement relates to model parameters or observables. Some studies isolate specific mechanisms (e.g., in vitro proliferation assays, ex vivo cytotoxicity studies) and directly constrain individual parameters, while clinical and in vivo endpoints constrain the integrated model through observables computed over the full system state.</w:t>
       </w:r>
     </w:p>
     <w:p>
@@ -368,7 +368,7 @@
         <w:pStyle w:val="FirstParagraph"/>
       </w:pPr>
       <w:r>
-        <w:t xml:space="preserve">The user specifies which model parameters need calibration, and the system builds a prompt that guides an LLM with web search capability to find relevant experimental literature. The framework supports multiple LLM providers (OpenAI, Anthropic, Google) through a common interface. In this study, we used GPT-5.1 for batch extraction and Claude Opus 4.6 for interactive extraction.</w:t>
+        <w:t xml:space="preserve">The user specifies which model parameters or observables need calibration, and the system builds a prompt that guides an LLM with web search capability to find relevant experimental literature. The framework supports multiple LLM providers (OpenAI, Anthropic, Google) through a common interface. In this study, we used GPT-5.1 for batch extraction and Claude Opus 4.6 for interactive extraction.</w:t>
       </w:r>
     </w:p>
     <w:p>
@@ -376,7 +376,7 @@
         <w:pStyle w:val="BodyText"/>
       </w:pPr>
       <w:r>
-        <w:t xml:space="preserve">The prompt injects mechanistic context from the model structure: for each target parameter, the system retrieves the parameter’s name, units, and description; the reactions where it appears with rate laws; the species involved; and the broader reaction network. This context guides the LLM toward experiments that constrain the target parameters. Source exclusion prevents reuse of papers across extractions to promote literature diversity. The prompt also includes the complete schema structure and guidance on common pitfalls (SEM vs. SD conversion, hardcoded constants, source relevance documentation), reducing the retry loop by preventing predictable errors.</w:t>
+        <w:t xml:space="preserve">The prompt injects mechanistic context from the model structure: for each target, the system retrieves its name, units, and description. For parameters, it also retrieves the reactions where the parameter appears with rate laws, the species involved, and the broader reaction network. For observables, it retrieves the species and compartments that define the observable. This context guides the LLM toward experiments that constrain the targets. Source exclusion prevents reuse of papers across extractions to promote literature diversity. The prompt also includes the complete schema structure and guidance on common pitfalls (SEM vs. SD conversion, hardcoded constants, source relevance documentation), reducing the retry loop by preventing predictable errors.</w:t>
       </w:r>
     </w:p>
     <w:bookmarkEnd w:id="21"/>
@@ -435,7 +435,7 @@
         <w:t xml:space="preserve"> </w:t>
       </w:r>
       <w:r>
-        <w:t xml:space="preserve">schema captures clinical and in vivo endpoints that constrain the full model through observables computed over the complete species state. Both schemas share a common design philosophy but differ in how they connect literature data to model parameters.</w:t>
+        <w:t xml:space="preserve">schema captures clinical and in vivo endpoints that constrain the full model through observables computed over the complete species state. Both schemas share a common design philosophy but differ in how they connect literature data to model parameters and outputs.</w:t>
       </w:r>
     </w:p>
     <w:bookmarkStart w:id="22" w:name="shared-design-principles"/>
@@ -488,7 +488,7 @@
         <w:pStyle w:val="FirstParagraph"/>
       </w:pPr>
       <w:r>
-        <w:t xml:space="preserve">The SubmodelTarget schema structures calibration targets into two layers: an</w:t>
+        <w:t xml:space="preserve">The SubmodelTarget schema structures each record into two layers: an</w:t>
       </w:r>
       <w:r>
         <w:t xml:space="preserve"> </w:t>
@@ -3420,7 +3420,7 @@
         <w:pStyle w:val="FirstParagraph"/>
       </w:pPr>
       <w:r>
-        <w:t xml:space="preserve">MAPLE demonstrates that structured schemas can serve as a productive collaboration interface between LLMs and modelers for QSP model calibration. The curation analysis reveals that modeler judgment contributes roughly half of the final calibration target content. Rather than automating away the modeler, the framework restructures the collaboration: the schema defines what must be captured, validators catch errors from both LLM and human sources, and the separation of data extraction from modeling decisions clarifies where different types of expertise are needed.</w:t>
+        <w:t xml:space="preserve">MAPLE demonstrates that structured schemas can serve as a productive collaboration interface between LLMs and modelers for QSP model calibration. The curation analysis reveals that modeler judgment contributes roughly half of the final record content. Rather than automating away the modeler, the framework restructures the collaboration: the schema defines what must be captured, validators catch errors from both LLM and human sources, and the separation of data extraction from modeling decisions clarifies where different types of expertise are needed.</w:t>
       </w:r>
     </w:p>
     <w:bookmarkStart w:id="51" w:name="validation-as-the-core-mechanism"/>

</xml_diff>